<commit_message>
Adding Non- Functional Requirements
</commit_message>
<xml_diff>
--- a/SwiftBot Task10 - Requirements.docx
+++ b/SwiftBot Task10 - Requirements.docx
@@ -172,7 +172,117 @@
       <w:r>
         <w:t>The system should provide feedback using LED lights</w:t>
       </w:r>
-      <w:r>
+    </w:p>
+    <w:p>
+      <w:pPr>
+        <w:spacing w:line="240" w:lineRule="auto"/>
+      </w:pPr>
+    </w:p>
+    <w:p>
+      <w:pPr>
+        <w:spacing w:line="240" w:lineRule="auto"/>
+        <w:rPr>
+          <w:b/>
+          <w:bCs/>
+          <w:u w:val="single"/>
+        </w:rPr>
+      </w:pPr>
+      <w:r>
+        <w:rPr>
+          <w:b/>
+          <w:bCs/>
+          <w:u w:val="single"/>
+        </w:rPr>
+        <w:t>Non</w:t>
+      </w:r>
+      <w:r>
+        <w:rPr>
+          <w:b/>
+          <w:bCs/>
+          <w:u w:val="single"/>
+        </w:rPr>
+        <w:t>- Functional Requirements</w:t>
+      </w:r>
+    </w:p>
+    <w:p>
+      <w:pPr>
+        <w:pStyle w:val="ListParagraph"/>
+        <w:numPr>
+          <w:ilvl w:val="0"/>
+          <w:numId w:val="2"/>
+        </w:numPr>
+        <w:spacing w:line="240" w:lineRule="auto"/>
+        <w:rPr>
+          <w:b/>
+          <w:bCs/>
+          <w:u w:val="single"/>
+        </w:rPr>
+      </w:pPr>
+      <w:r>
+        <w:t>The system should respond quickly to user inputs</w:t>
+      </w:r>
+    </w:p>
+    <w:p>
+      <w:pPr>
+        <w:pStyle w:val="ListParagraph"/>
+        <w:numPr>
+          <w:ilvl w:val="0"/>
+          <w:numId w:val="2"/>
+        </w:numPr>
+        <w:spacing w:line="240" w:lineRule="auto"/>
+        <w:rPr>
+          <w:b/>
+          <w:bCs/>
+          <w:u w:val="single"/>
+        </w:rPr>
+      </w:pPr>
+      <w:r>
+        <w:t>The system should be reliable during operation</w:t>
+      </w:r>
+    </w:p>
+    <w:p>
+      <w:pPr>
+        <w:pStyle w:val="ListParagraph"/>
+        <w:numPr>
+          <w:ilvl w:val="0"/>
+          <w:numId w:val="2"/>
+        </w:numPr>
+        <w:spacing w:line="240" w:lineRule="auto"/>
+        <w:rPr>
+          <w:b/>
+          <w:bCs/>
+          <w:u w:val="single"/>
+        </w:rPr>
+      </w:pPr>
+      <w:r>
+        <w:t>The system should be easy to use.</w:t>
+      </w:r>
+    </w:p>
+    <w:p>
+      <w:pPr>
+        <w:spacing w:line="240" w:lineRule="auto"/>
+        <w:rPr>
+          <w:b/>
+          <w:bCs/>
+          <w:u w:val="single"/>
+        </w:rPr>
+      </w:pPr>
+    </w:p>
+    <w:p>
+      <w:pPr>
+        <w:spacing w:line="240" w:lineRule="auto"/>
+        <w:rPr>
+          <w:b/>
+          <w:bCs/>
+          <w:u w:val="single"/>
+        </w:rPr>
+      </w:pPr>
+      <w:r>
+        <w:rPr>
+          <w:b/>
+          <w:bCs/>
+          <w:u w:val="single"/>
+        </w:rPr>
         <w:br/>
       </w:r>
     </w:p>
@@ -313,8 +423,124 @@
       </w:rPr>
     </w:lvl>
   </w:abstractNum>
+  <w:abstractNum w:abstractNumId="1" w15:restartNumberingAfterBreak="0">
+    <w:nsid w:val="37F319B4"/>
+    <w:multiLevelType w:val="multilevel"/>
+    <w:tmpl w:val="08090021"/>
+    <w:lvl w:ilvl="0">
+      <w:start w:val="1"/>
+      <w:numFmt w:val="bullet"/>
+      <w:lvlText w:val=""/>
+      <w:lvlJc w:val="left"/>
+      <w:pPr>
+        <w:ind w:left="360" w:hanging="360"/>
+      </w:pPr>
+      <w:rPr>
+        <w:rFonts w:ascii="Wingdings" w:hAnsi="Wingdings" w:hint="default"/>
+      </w:rPr>
+    </w:lvl>
+    <w:lvl w:ilvl="1">
+      <w:start w:val="1"/>
+      <w:numFmt w:val="bullet"/>
+      <w:lvlText w:val=""/>
+      <w:lvlJc w:val="left"/>
+      <w:pPr>
+        <w:ind w:left="720" w:hanging="360"/>
+      </w:pPr>
+      <w:rPr>
+        <w:rFonts w:ascii="Wingdings" w:hAnsi="Wingdings" w:hint="default"/>
+      </w:rPr>
+    </w:lvl>
+    <w:lvl w:ilvl="2">
+      <w:start w:val="1"/>
+      <w:numFmt w:val="bullet"/>
+      <w:lvlText w:val=""/>
+      <w:lvlJc w:val="left"/>
+      <w:pPr>
+        <w:ind w:left="1080" w:hanging="360"/>
+      </w:pPr>
+      <w:rPr>
+        <w:rFonts w:ascii="Wingdings" w:hAnsi="Wingdings" w:hint="default"/>
+      </w:rPr>
+    </w:lvl>
+    <w:lvl w:ilvl="3">
+      <w:start w:val="1"/>
+      <w:numFmt w:val="bullet"/>
+      <w:lvlText w:val=""/>
+      <w:lvlJc w:val="left"/>
+      <w:pPr>
+        <w:ind w:left="1440" w:hanging="360"/>
+      </w:pPr>
+      <w:rPr>
+        <w:rFonts w:ascii="Symbol" w:hAnsi="Symbol" w:hint="default"/>
+      </w:rPr>
+    </w:lvl>
+    <w:lvl w:ilvl="4">
+      <w:start w:val="1"/>
+      <w:numFmt w:val="bullet"/>
+      <w:lvlText w:val=""/>
+      <w:lvlJc w:val="left"/>
+      <w:pPr>
+        <w:ind w:left="1800" w:hanging="360"/>
+      </w:pPr>
+      <w:rPr>
+        <w:rFonts w:ascii="Symbol" w:hAnsi="Symbol" w:hint="default"/>
+      </w:rPr>
+    </w:lvl>
+    <w:lvl w:ilvl="5">
+      <w:start w:val="1"/>
+      <w:numFmt w:val="bullet"/>
+      <w:lvlText w:val=""/>
+      <w:lvlJc w:val="left"/>
+      <w:pPr>
+        <w:ind w:left="2160" w:hanging="360"/>
+      </w:pPr>
+      <w:rPr>
+        <w:rFonts w:ascii="Wingdings" w:hAnsi="Wingdings" w:hint="default"/>
+      </w:rPr>
+    </w:lvl>
+    <w:lvl w:ilvl="6">
+      <w:start w:val="1"/>
+      <w:numFmt w:val="bullet"/>
+      <w:lvlText w:val=""/>
+      <w:lvlJc w:val="left"/>
+      <w:pPr>
+        <w:ind w:left="2520" w:hanging="360"/>
+      </w:pPr>
+      <w:rPr>
+        <w:rFonts w:ascii="Wingdings" w:hAnsi="Wingdings" w:hint="default"/>
+      </w:rPr>
+    </w:lvl>
+    <w:lvl w:ilvl="7">
+      <w:start w:val="1"/>
+      <w:numFmt w:val="bullet"/>
+      <w:lvlText w:val=""/>
+      <w:lvlJc w:val="left"/>
+      <w:pPr>
+        <w:ind w:left="2880" w:hanging="360"/>
+      </w:pPr>
+      <w:rPr>
+        <w:rFonts w:ascii="Symbol" w:hAnsi="Symbol" w:hint="default"/>
+      </w:rPr>
+    </w:lvl>
+    <w:lvl w:ilvl="8">
+      <w:start w:val="1"/>
+      <w:numFmt w:val="bullet"/>
+      <w:lvlText w:val=""/>
+      <w:lvlJc w:val="left"/>
+      <w:pPr>
+        <w:ind w:left="3240" w:hanging="360"/>
+      </w:pPr>
+      <w:rPr>
+        <w:rFonts w:ascii="Symbol" w:hAnsi="Symbol" w:hint="default"/>
+      </w:rPr>
+    </w:lvl>
+  </w:abstractNum>
   <w:num w:numId="1" w16cid:durableId="1045789527">
     <w:abstractNumId w:val="0"/>
+  </w:num>
+  <w:num w:numId="2" w16cid:durableId="353507854">
+    <w:abstractNumId w:val="1"/>
   </w:num>
 </w:numbering>
 </file>

</xml_diff>

<commit_message>
improved requirements on Initial LLM requirements
</commit_message>
<xml_diff>
--- a/SwiftBot Task10 - Requirements.docx
+++ b/SwiftBot Task10 - Requirements.docx
@@ -267,6 +267,125 @@
           <w:u w:val="single"/>
         </w:rPr>
       </w:pPr>
+    </w:p>
+    <w:p>
+      <w:pPr>
+        <w:spacing w:line="240" w:lineRule="auto"/>
+        <w:rPr>
+          <w:b/>
+          <w:bCs/>
+          <w:u w:val="single"/>
+        </w:rPr>
+      </w:pPr>
+      <w:r>
+        <w:rPr>
+          <w:b/>
+          <w:bCs/>
+          <w:u w:val="single"/>
+        </w:rPr>
+        <w:t xml:space="preserve">Improvement </w:t>
+      </w:r>
+      <w:r>
+        <w:rPr>
+          <w:b/>
+          <w:bCs/>
+          <w:u w:val="single"/>
+        </w:rPr>
+        <w:t>M</w:t>
+      </w:r>
+      <w:r>
+        <w:rPr>
+          <w:b/>
+          <w:bCs/>
+          <w:u w:val="single"/>
+        </w:rPr>
+        <w:t>ad</w:t>
+      </w:r>
+      <w:r>
+        <w:rPr>
+          <w:b/>
+          <w:bCs/>
+          <w:u w:val="single"/>
+        </w:rPr>
+        <w:t xml:space="preserve">e to the Initial </w:t>
+      </w:r>
+      <w:r>
+        <w:rPr>
+          <w:b/>
+          <w:bCs/>
+          <w:u w:val="single"/>
+        </w:rPr>
+        <w:t>Requirements</w:t>
+      </w:r>
+    </w:p>
+    <w:p>
+      <w:pPr>
+        <w:pStyle w:val="ListParagraph"/>
+        <w:numPr>
+          <w:ilvl w:val="0"/>
+          <w:numId w:val="4"/>
+        </w:numPr>
+        <w:spacing w:line="240" w:lineRule="auto"/>
+      </w:pPr>
+      <w:r>
+        <w:t xml:space="preserve">Each encounter </w:t>
+      </w:r>
+      <w:r>
+        <w:t xml:space="preserve">made by the SwiftBot shall be recorded </w:t>
+      </w:r>
+      <w:r>
+        <w:t>in Log</w:t>
+      </w:r>
+      <w:r>
+        <w:t xml:space="preserve"> File</w:t>
+      </w:r>
+    </w:p>
+    <w:p>
+      <w:pPr>
+        <w:pStyle w:val="ListParagraph"/>
+        <w:numPr>
+          <w:ilvl w:val="0"/>
+          <w:numId w:val="4"/>
+        </w:numPr>
+        <w:spacing w:line="240" w:lineRule="auto"/>
+      </w:pPr>
+      <w:r>
+        <w:t xml:space="preserve">Response to object detection shall be </w:t>
+      </w:r>
+      <w:r>
+        <w:t>within 1 – 2 seconds</w:t>
+      </w:r>
+    </w:p>
+    <w:p>
+      <w:pPr>
+        <w:pStyle w:val="ListParagraph"/>
+        <w:numPr>
+          <w:ilvl w:val="0"/>
+          <w:numId w:val="4"/>
+        </w:numPr>
+        <w:spacing w:line="240" w:lineRule="auto"/>
+      </w:pPr>
+      <w:r>
+        <w:t xml:space="preserve">Clear error message shall be </w:t>
+      </w:r>
+      <w:r>
+        <w:t>display in the case</w:t>
+      </w:r>
+      <w:r>
+        <w:t xml:space="preserve"> of an invalid </w:t>
+      </w:r>
+      <w:r>
+        <w:t>QR code scanned</w:t>
+      </w:r>
+      <w:r>
+        <w:t xml:space="preserve"> </w:t>
+      </w:r>
+      <w:r>
+        <w:t xml:space="preserve">(reflection on the system should be easy to use, this can be test by </w:t>
+      </w:r>
+      <w:r>
+        <w:t>scanning an invalid QR code)</w:t>
+      </w:r>
     </w:p>
     <w:p>
       <w:pPr>
@@ -424,6 +543,232 @@
     </w:lvl>
   </w:abstractNum>
   <w:abstractNum w:abstractNumId="1" w15:restartNumberingAfterBreak="0">
+    <w:nsid w:val="1B0B24B8"/>
+    <w:multiLevelType w:val="multilevel"/>
+    <w:tmpl w:val="08090021"/>
+    <w:lvl w:ilvl="0">
+      <w:start w:val="1"/>
+      <w:numFmt w:val="bullet"/>
+      <w:lvlText w:val=""/>
+      <w:lvlJc w:val="left"/>
+      <w:pPr>
+        <w:ind w:left="360" w:hanging="360"/>
+      </w:pPr>
+      <w:rPr>
+        <w:rFonts w:ascii="Wingdings" w:hAnsi="Wingdings" w:hint="default"/>
+      </w:rPr>
+    </w:lvl>
+    <w:lvl w:ilvl="1">
+      <w:start w:val="1"/>
+      <w:numFmt w:val="bullet"/>
+      <w:lvlText w:val=""/>
+      <w:lvlJc w:val="left"/>
+      <w:pPr>
+        <w:ind w:left="720" w:hanging="360"/>
+      </w:pPr>
+      <w:rPr>
+        <w:rFonts w:ascii="Wingdings" w:hAnsi="Wingdings" w:hint="default"/>
+      </w:rPr>
+    </w:lvl>
+    <w:lvl w:ilvl="2">
+      <w:start w:val="1"/>
+      <w:numFmt w:val="bullet"/>
+      <w:lvlText w:val=""/>
+      <w:lvlJc w:val="left"/>
+      <w:pPr>
+        <w:ind w:left="1080" w:hanging="360"/>
+      </w:pPr>
+      <w:rPr>
+        <w:rFonts w:ascii="Wingdings" w:hAnsi="Wingdings" w:hint="default"/>
+      </w:rPr>
+    </w:lvl>
+    <w:lvl w:ilvl="3">
+      <w:start w:val="1"/>
+      <w:numFmt w:val="bullet"/>
+      <w:lvlText w:val=""/>
+      <w:lvlJc w:val="left"/>
+      <w:pPr>
+        <w:ind w:left="1440" w:hanging="360"/>
+      </w:pPr>
+      <w:rPr>
+        <w:rFonts w:ascii="Symbol" w:hAnsi="Symbol" w:hint="default"/>
+      </w:rPr>
+    </w:lvl>
+    <w:lvl w:ilvl="4">
+      <w:start w:val="1"/>
+      <w:numFmt w:val="bullet"/>
+      <w:lvlText w:val=""/>
+      <w:lvlJc w:val="left"/>
+      <w:pPr>
+        <w:ind w:left="1800" w:hanging="360"/>
+      </w:pPr>
+      <w:rPr>
+        <w:rFonts w:ascii="Symbol" w:hAnsi="Symbol" w:hint="default"/>
+      </w:rPr>
+    </w:lvl>
+    <w:lvl w:ilvl="5">
+      <w:start w:val="1"/>
+      <w:numFmt w:val="bullet"/>
+      <w:lvlText w:val=""/>
+      <w:lvlJc w:val="left"/>
+      <w:pPr>
+        <w:ind w:left="2160" w:hanging="360"/>
+      </w:pPr>
+      <w:rPr>
+        <w:rFonts w:ascii="Wingdings" w:hAnsi="Wingdings" w:hint="default"/>
+      </w:rPr>
+    </w:lvl>
+    <w:lvl w:ilvl="6">
+      <w:start w:val="1"/>
+      <w:numFmt w:val="bullet"/>
+      <w:lvlText w:val=""/>
+      <w:lvlJc w:val="left"/>
+      <w:pPr>
+        <w:ind w:left="2520" w:hanging="360"/>
+      </w:pPr>
+      <w:rPr>
+        <w:rFonts w:ascii="Wingdings" w:hAnsi="Wingdings" w:hint="default"/>
+      </w:rPr>
+    </w:lvl>
+    <w:lvl w:ilvl="7">
+      <w:start w:val="1"/>
+      <w:numFmt w:val="bullet"/>
+      <w:lvlText w:val=""/>
+      <w:lvlJc w:val="left"/>
+      <w:pPr>
+        <w:ind w:left="2880" w:hanging="360"/>
+      </w:pPr>
+      <w:rPr>
+        <w:rFonts w:ascii="Symbol" w:hAnsi="Symbol" w:hint="default"/>
+      </w:rPr>
+    </w:lvl>
+    <w:lvl w:ilvl="8">
+      <w:start w:val="1"/>
+      <w:numFmt w:val="bullet"/>
+      <w:lvlText w:val=""/>
+      <w:lvlJc w:val="left"/>
+      <w:pPr>
+        <w:ind w:left="3240" w:hanging="360"/>
+      </w:pPr>
+      <w:rPr>
+        <w:rFonts w:ascii="Symbol" w:hAnsi="Symbol" w:hint="default"/>
+      </w:rPr>
+    </w:lvl>
+  </w:abstractNum>
+  <w:abstractNum w:abstractNumId="2" w15:restartNumberingAfterBreak="0">
+    <w:nsid w:val="2C336E97"/>
+    <w:multiLevelType w:val="multilevel"/>
+    <w:tmpl w:val="08090021"/>
+    <w:lvl w:ilvl="0">
+      <w:start w:val="1"/>
+      <w:numFmt w:val="bullet"/>
+      <w:lvlText w:val=""/>
+      <w:lvlJc w:val="left"/>
+      <w:pPr>
+        <w:ind w:left="360" w:hanging="360"/>
+      </w:pPr>
+      <w:rPr>
+        <w:rFonts w:ascii="Wingdings" w:hAnsi="Wingdings" w:hint="default"/>
+      </w:rPr>
+    </w:lvl>
+    <w:lvl w:ilvl="1">
+      <w:start w:val="1"/>
+      <w:numFmt w:val="bullet"/>
+      <w:lvlText w:val=""/>
+      <w:lvlJc w:val="left"/>
+      <w:pPr>
+        <w:ind w:left="720" w:hanging="360"/>
+      </w:pPr>
+      <w:rPr>
+        <w:rFonts w:ascii="Wingdings" w:hAnsi="Wingdings" w:hint="default"/>
+      </w:rPr>
+    </w:lvl>
+    <w:lvl w:ilvl="2">
+      <w:start w:val="1"/>
+      <w:numFmt w:val="bullet"/>
+      <w:lvlText w:val=""/>
+      <w:lvlJc w:val="left"/>
+      <w:pPr>
+        <w:ind w:left="1080" w:hanging="360"/>
+      </w:pPr>
+      <w:rPr>
+        <w:rFonts w:ascii="Wingdings" w:hAnsi="Wingdings" w:hint="default"/>
+      </w:rPr>
+    </w:lvl>
+    <w:lvl w:ilvl="3">
+      <w:start w:val="1"/>
+      <w:numFmt w:val="bullet"/>
+      <w:lvlText w:val=""/>
+      <w:lvlJc w:val="left"/>
+      <w:pPr>
+        <w:ind w:left="1440" w:hanging="360"/>
+      </w:pPr>
+      <w:rPr>
+        <w:rFonts w:ascii="Symbol" w:hAnsi="Symbol" w:hint="default"/>
+      </w:rPr>
+    </w:lvl>
+    <w:lvl w:ilvl="4">
+      <w:start w:val="1"/>
+      <w:numFmt w:val="bullet"/>
+      <w:lvlText w:val=""/>
+      <w:lvlJc w:val="left"/>
+      <w:pPr>
+        <w:ind w:left="1800" w:hanging="360"/>
+      </w:pPr>
+      <w:rPr>
+        <w:rFonts w:ascii="Symbol" w:hAnsi="Symbol" w:hint="default"/>
+      </w:rPr>
+    </w:lvl>
+    <w:lvl w:ilvl="5">
+      <w:start w:val="1"/>
+      <w:numFmt w:val="bullet"/>
+      <w:lvlText w:val=""/>
+      <w:lvlJc w:val="left"/>
+      <w:pPr>
+        <w:ind w:left="2160" w:hanging="360"/>
+      </w:pPr>
+      <w:rPr>
+        <w:rFonts w:ascii="Wingdings" w:hAnsi="Wingdings" w:hint="default"/>
+      </w:rPr>
+    </w:lvl>
+    <w:lvl w:ilvl="6">
+      <w:start w:val="1"/>
+      <w:numFmt w:val="bullet"/>
+      <w:lvlText w:val=""/>
+      <w:lvlJc w:val="left"/>
+      <w:pPr>
+        <w:ind w:left="2520" w:hanging="360"/>
+      </w:pPr>
+      <w:rPr>
+        <w:rFonts w:ascii="Wingdings" w:hAnsi="Wingdings" w:hint="default"/>
+      </w:rPr>
+    </w:lvl>
+    <w:lvl w:ilvl="7">
+      <w:start w:val="1"/>
+      <w:numFmt w:val="bullet"/>
+      <w:lvlText w:val=""/>
+      <w:lvlJc w:val="left"/>
+      <w:pPr>
+        <w:ind w:left="2880" w:hanging="360"/>
+      </w:pPr>
+      <w:rPr>
+        <w:rFonts w:ascii="Symbol" w:hAnsi="Symbol" w:hint="default"/>
+      </w:rPr>
+    </w:lvl>
+    <w:lvl w:ilvl="8">
+      <w:start w:val="1"/>
+      <w:numFmt w:val="bullet"/>
+      <w:lvlText w:val=""/>
+      <w:lvlJc w:val="left"/>
+      <w:pPr>
+        <w:ind w:left="3240" w:hanging="360"/>
+      </w:pPr>
+      <w:rPr>
+        <w:rFonts w:ascii="Symbol" w:hAnsi="Symbol" w:hint="default"/>
+      </w:rPr>
+    </w:lvl>
+  </w:abstractNum>
+  <w:abstractNum w:abstractNumId="3" w15:restartNumberingAfterBreak="0">
     <w:nsid w:val="37F319B4"/>
     <w:multiLevelType w:val="multilevel"/>
     <w:tmpl w:val="08090021"/>
@@ -540,7 +885,13 @@
     <w:abstractNumId w:val="0"/>
   </w:num>
   <w:num w:numId="2" w16cid:durableId="353507854">
+    <w:abstractNumId w:val="3"/>
+  </w:num>
+  <w:num w:numId="3" w16cid:durableId="991444405">
     <w:abstractNumId w:val="1"/>
+  </w:num>
+  <w:num w:numId="4" w16cid:durableId="1139609871">
+    <w:abstractNumId w:val="2"/>
   </w:num>
 </w:numbering>
 </file>

</xml_diff>

<commit_message>
Another improvement to initial requirement
</commit_message>
<xml_diff>
--- a/SwiftBot Task10 - Requirements.docx
+++ b/SwiftBot Task10 - Requirements.docx
@@ -328,16 +328,19 @@
         <w:spacing w:line="240" w:lineRule="auto"/>
       </w:pPr>
       <w:r>
-        <w:t xml:space="preserve">Each encounter </w:t>
-      </w:r>
-      <w:r>
-        <w:t xml:space="preserve">made by the SwiftBot shall be recorded </w:t>
-      </w:r>
-      <w:r>
-        <w:t>in Log</w:t>
-      </w:r>
-      <w:r>
-        <w:t xml:space="preserve"> File</w:t>
+        <w:t xml:space="preserve">Response to object detection shall be </w:t>
+      </w:r>
+      <w:r>
+        <w:t xml:space="preserve">within 1 – 2 </w:t>
+      </w:r>
+      <w:r>
+        <w:t>seconds (</w:t>
+      </w:r>
+      <w:r>
+        <w:t xml:space="preserve">Defines </w:t>
+      </w:r>
+      <w:r>
+        <w:t>How to respond quickly to user input)</w:t>
       </w:r>
     </w:p>
     <w:p>
@@ -350,10 +353,25 @@
         <w:spacing w:line="240" w:lineRule="auto"/>
       </w:pPr>
       <w:r>
-        <w:t xml:space="preserve">Response to object detection shall be </w:t>
-      </w:r>
-      <w:r>
-        <w:t>within 1 – 2 seconds</w:t>
+        <w:t xml:space="preserve">Clear error message shall be </w:t>
+      </w:r>
+      <w:r>
+        <w:t>display in the case</w:t>
+      </w:r>
+      <w:r>
+        <w:t xml:space="preserve"> of an invalid </w:t>
+      </w:r>
+      <w:r>
+        <w:t>QR code scanned</w:t>
+      </w:r>
+      <w:r>
+        <w:t xml:space="preserve"> </w:t>
+      </w:r>
+      <w:r>
+        <w:t xml:space="preserve">(reflection on the system should be easy to use, this can be test by </w:t>
+      </w:r>
+      <w:r>
+        <w:t>scanning an invalid QR code)</w:t>
       </w:r>
     </w:p>
     <w:p>
@@ -366,26 +384,55 @@
         <w:spacing w:line="240" w:lineRule="auto"/>
       </w:pPr>
       <w:r>
-        <w:t xml:space="preserve">Clear error message shall be </w:t>
-      </w:r>
-      <w:r>
-        <w:t>display in the case</w:t>
-      </w:r>
-      <w:r>
-        <w:t xml:space="preserve"> of an invalid </w:t>
-      </w:r>
-      <w:r>
-        <w:t>QR code scanned</w:t>
-      </w:r>
-      <w:r>
-        <w:t xml:space="preserve"> </w:t>
-      </w:r>
-      <w:r>
-        <w:t xml:space="preserve">(reflection on the system should be easy to use, this can be test by </w:t>
-      </w:r>
-      <w:r>
-        <w:t>scanning an invalid QR code)</w:t>
-      </w:r>
+        <w:t xml:space="preserve"> SwifBot shall detect objects in the range of </w:t>
+      </w:r>
+      <w:r>
+        <w:t>2 meters</w:t>
+      </w:r>
+    </w:p>
+    <w:p>
+      <w:pPr>
+        <w:pStyle w:val="ListParagraph"/>
+        <w:numPr>
+          <w:ilvl w:val="0"/>
+          <w:numId w:val="4"/>
+        </w:numPr>
+        <w:spacing w:line="240" w:lineRule="auto"/>
+      </w:pPr>
+      <w:r>
+        <w:t xml:space="preserve">SwiftBot blink green </w:t>
+      </w:r>
+      <w:r>
+        <w:t>when maintaining buffer distance and red when retreating from an object</w:t>
+      </w:r>
+    </w:p>
+    <w:p>
+      <w:pPr>
+        <w:pStyle w:val="ListParagraph"/>
+        <w:spacing w:line="240" w:lineRule="auto"/>
+        <w:ind w:left="360"/>
+      </w:pPr>
+    </w:p>
+    <w:p>
+      <w:pPr>
+        <w:pStyle w:val="ListParagraph"/>
+        <w:spacing w:line="240" w:lineRule="auto"/>
+        <w:ind w:left="360"/>
+      </w:pPr>
+    </w:p>
+    <w:p>
+      <w:pPr>
+        <w:pStyle w:val="ListParagraph"/>
+        <w:spacing w:line="240" w:lineRule="auto"/>
+        <w:ind w:left="360"/>
+      </w:pPr>
+    </w:p>
+    <w:p>
+      <w:pPr>
+        <w:pStyle w:val="ListParagraph"/>
+        <w:spacing w:line="240" w:lineRule="auto"/>
+        <w:ind w:left="360"/>
+      </w:pPr>
     </w:p>
     <w:p>
       <w:pPr>
@@ -402,6 +449,7 @@
           <w:bCs/>
           <w:u w:val="single"/>
         </w:rPr>
+        <w:lastRenderedPageBreak/>
         <w:br/>
       </w:r>
     </w:p>

</xml_diff>

<commit_message>
Adding dubious and Scardy mode Specification
</commit_message>
<xml_diff>
--- a/SwiftBot Task10 - Requirements.docx
+++ b/SwiftBot Task10 - Requirements.docx
@@ -662,6 +662,102 @@
       <w:r>
         <w:t>an image after each Curios-mode response</w:t>
       </w:r>
+    </w:p>
+    <w:p>
+      <w:pPr>
+        <w:pStyle w:val="ListParagraph"/>
+        <w:numPr>
+          <w:ilvl w:val="0"/>
+          <w:numId w:val="7"/>
+        </w:numPr>
+        <w:spacing w:line="240" w:lineRule="auto"/>
+        <w:rPr>
+          <w:b/>
+          <w:bCs/>
+          <w:u w:val="single"/>
+        </w:rPr>
+      </w:pPr>
+      <w:r>
+        <w:t>Blink red in scaredy mode when obje</w:t>
+      </w:r>
+      <w:r>
+        <w:t>ct is within 50cm and capture image</w:t>
+      </w:r>
+      <w:r>
+        <w:t xml:space="preserve"> then </w:t>
+      </w:r>
+      <w:r>
+        <w:t xml:space="preserve">turn by moving backwards </w:t>
+      </w:r>
+      <w:r>
+        <w:t>for 3 seconds</w:t>
+      </w:r>
+    </w:p>
+    <w:p>
+      <w:pPr>
+        <w:pStyle w:val="ListParagraph"/>
+        <w:numPr>
+          <w:ilvl w:val="0"/>
+          <w:numId w:val="7"/>
+        </w:numPr>
+        <w:spacing w:line="240" w:lineRule="auto"/>
+        <w:rPr>
+          <w:b/>
+          <w:bCs/>
+          <w:u w:val="single"/>
+        </w:rPr>
+      </w:pPr>
+      <w:r>
+        <w:t>In Dubious mode, randomly execute Curious or Scaredy behaviour</w:t>
+      </w:r>
+    </w:p>
+    <w:p>
+      <w:pPr>
+        <w:pStyle w:val="ListParagraph"/>
+        <w:numPr>
+          <w:ilvl w:val="0"/>
+          <w:numId w:val="7"/>
+        </w:numPr>
+        <w:spacing w:line="240" w:lineRule="auto"/>
+        <w:rPr>
+          <w:b/>
+          <w:bCs/>
+          <w:u w:val="single"/>
+        </w:rPr>
+      </w:pPr>
+      <w:r>
+        <w:t>In</w:t>
+      </w:r>
+      <w:r>
+        <w:t xml:space="preserve"> </w:t>
+      </w:r>
+      <w:r>
+        <w:t xml:space="preserve">case </w:t>
+      </w:r>
+      <w:r>
+        <w:t xml:space="preserve">more than 3 objects are </w:t>
+      </w:r>
+      <w:r>
+        <w:t xml:space="preserve">detected within </w:t>
+      </w:r>
+      <w:r>
+        <w:t>5 minutes, prompt user to change mode or terminate</w:t>
+      </w:r>
+    </w:p>
+    <w:p>
+      <w:pPr>
+        <w:pStyle w:val="ListParagraph"/>
+        <w:numPr>
+          <w:ilvl w:val="0"/>
+          <w:numId w:val="7"/>
+        </w:numPr>
+        <w:spacing w:line="240" w:lineRule="auto"/>
+        <w:rPr>
+          <w:b/>
+          <w:bCs/>
+          <w:u w:val="single"/>
+        </w:rPr>
+      </w:pPr>
     </w:p>
     <w:p>
       <w:pPr>

</xml_diff>

<commit_message>
Finish requirement Specification for Functionality
</commit_message>
<xml_diff>
--- a/SwiftBot Task10 - Requirements.docx
+++ b/SwiftBot Task10 - Requirements.docx
@@ -464,6 +464,22 @@
         <w:lastRenderedPageBreak/>
         <w:t>The improved Requirements Specification</w:t>
       </w:r>
+      <w:r>
+        <w:rPr>
+          <w:b/>
+          <w:bCs/>
+          <w:u w:val="single"/>
+        </w:rPr>
+        <w:t>(Functional</w:t>
+      </w:r>
+      <w:r>
+        <w:rPr>
+          <w:b/>
+          <w:bCs/>
+          <w:u w:val="single"/>
+        </w:rPr>
+        <w:t>)</w:t>
+      </w:r>
     </w:p>
     <w:p>
       <w:pPr>
@@ -758,6 +774,12 @@
           <w:u w:val="single"/>
         </w:rPr>
       </w:pPr>
+      <w:r>
+        <w:t xml:space="preserve">To terminate </w:t>
+      </w:r>
+      <w:r>
+        <w:t>press X</w:t>
+      </w:r>
     </w:p>
     <w:p>
       <w:pPr>
@@ -773,6 +795,51 @@
           <w:u w:val="single"/>
         </w:rPr>
       </w:pPr>
+      <w:r>
+        <w:t xml:space="preserve">Log file </w:t>
+      </w:r>
+      <w:r>
+        <w:t xml:space="preserve">should be written on termination: mode executed, executed </w:t>
+      </w:r>
+      <w:r>
+        <w:t>duration</w:t>
+      </w:r>
+      <w:r>
+        <w:t>,</w:t>
+      </w:r>
+      <w:r>
+        <w:t xml:space="preserve"> obje</w:t>
+      </w:r>
+      <w:r>
+        <w:t>c</w:t>
+      </w:r>
+      <w:r>
+        <w:t>ts</w:t>
+      </w:r>
+      <w:r>
+        <w:t xml:space="preserve"> detected, saved image paths</w:t>
+      </w:r>
+    </w:p>
+    <w:p>
+      <w:pPr>
+        <w:pStyle w:val="ListParagraph"/>
+        <w:numPr>
+          <w:ilvl w:val="0"/>
+          <w:numId w:val="7"/>
+        </w:numPr>
+        <w:spacing w:line="240" w:lineRule="auto"/>
+        <w:rPr>
+          <w:b/>
+          <w:bCs/>
+          <w:u w:val="single"/>
+        </w:rPr>
+      </w:pPr>
+      <w:r>
+        <w:t xml:space="preserve">Exit by </w:t>
+      </w:r>
+      <w:r>
+        <w:t>displaying log file path</w:t>
+      </w:r>
     </w:p>
     <w:p>
       <w:pPr>

</xml_diff>

<commit_message>
Final touch for Non-Functional Specification
</commit_message>
<xml_diff>
--- a/SwiftBot Task10 - Requirements.docx
+++ b/SwiftBot Task10 - Requirements.docx
@@ -462,15 +462,31 @@
           <w:u w:val="single"/>
         </w:rPr>
         <w:lastRenderedPageBreak/>
-        <w:t>The improved Requirements Specification</w:t>
-      </w:r>
-      <w:r>
-        <w:rPr>
-          <w:b/>
-          <w:bCs/>
-          <w:u w:val="single"/>
-        </w:rPr>
-        <w:t>(Functional</w:t>
+        <w:t xml:space="preserve">The improved Requirements </w:t>
+      </w:r>
+      <w:r>
+        <w:rPr>
+          <w:b/>
+          <w:bCs/>
+          <w:u w:val="single"/>
+        </w:rPr>
+        <w:t>Specification</w:t>
+      </w:r>
+      <w:r>
+        <w:rPr>
+          <w:b/>
+          <w:bCs/>
+          <w:u w:val="single"/>
+        </w:rPr>
+        <w:t xml:space="preserve"> (</w:t>
+      </w:r>
+      <w:r>
+        <w:rPr>
+          <w:b/>
+          <w:bCs/>
+          <w:u w:val="single"/>
+        </w:rPr>
+        <w:t>Functional</w:t>
       </w:r>
       <w:r>
         <w:rPr>

</xml_diff>

<commit_message>
Initial LLM Generated Flowchart
</commit_message>
<xml_diff>
--- a/SwiftBot Task10 - Requirements.docx
+++ b/SwiftBot Task10 - Requirements.docx
@@ -1141,6 +1141,160 @@
           <w:u w:val="single"/>
         </w:rPr>
         <w:t>Flowchart design generated by the LLM (initial)</w:t>
+      </w:r>
+    </w:p>
+    <w:p>
+      <w:pPr>
+        <w:spacing w:line="240" w:lineRule="auto"/>
+      </w:pPr>
+      <w:r>
+        <w:t>flowchart TD</w:t>
+      </w:r>
+    </w:p>
+    <w:p>
+      <w:pPr>
+        <w:spacing w:line="240" w:lineRule="auto"/>
+      </w:pPr>
+      <w:r>
+        <w:t xml:space="preserve">A([Start]) --&gt; </w:t>
+      </w:r>
+      <w:r>
+        <w:t>B [</w:t>
+      </w:r>
+      <w:r>
+        <w:t>Scan QR for Mode]</w:t>
+      </w:r>
+    </w:p>
+    <w:p>
+      <w:pPr>
+        <w:spacing w:line="240" w:lineRule="auto"/>
+      </w:pPr>
+      <w:r>
+        <w:t xml:space="preserve">B --&gt; </w:t>
+      </w:r>
+      <w:r>
+        <w:t>C {</w:t>
+      </w:r>
+      <w:r>
+        <w:t>Mode valid?}</w:t>
+      </w:r>
+    </w:p>
+    <w:p>
+      <w:pPr>
+        <w:spacing w:line="240" w:lineRule="auto"/>
+      </w:pPr>
+      <w:r>
+        <w:t>C -- No --&gt; B</w:t>
+      </w:r>
+    </w:p>
+    <w:p>
+      <w:pPr>
+        <w:spacing w:line="240" w:lineRule="auto"/>
+      </w:pPr>
+      <w:r>
+        <w:t>C -- Yes --&gt; D[Wander]</w:t>
+      </w:r>
+    </w:p>
+    <w:p>
+      <w:pPr>
+        <w:spacing w:line="240" w:lineRule="auto"/>
+      </w:pPr>
+      <w:r>
+        <w:t xml:space="preserve">D --&gt; </w:t>
+      </w:r>
+      <w:r>
+        <w:t>E {</w:t>
+      </w:r>
+      <w:r>
+        <w:t>Object detected?}</w:t>
+      </w:r>
+    </w:p>
+    <w:p>
+      <w:pPr>
+        <w:spacing w:line="240" w:lineRule="auto"/>
+      </w:pPr>
+      <w:r>
+        <w:t>E -- No --&gt; D</w:t>
+      </w:r>
+    </w:p>
+    <w:p>
+      <w:pPr>
+        <w:spacing w:line="240" w:lineRule="auto"/>
+      </w:pPr>
+      <w:r>
+        <w:t xml:space="preserve">E -- Yes --&gt; </w:t>
+      </w:r>
+      <w:r>
+        <w:t>F [</w:t>
+      </w:r>
+      <w:r>
+        <w:t>React based on mode]</w:t>
+      </w:r>
+    </w:p>
+    <w:p>
+      <w:pPr>
+        <w:spacing w:line="240" w:lineRule="auto"/>
+      </w:pPr>
+      <w:r>
+        <w:t xml:space="preserve">F --&gt; </w:t>
+      </w:r>
+      <w:r>
+        <w:t>G {</w:t>
+      </w:r>
+      <w:r>
+        <w:t>More than 3 objects in 5 min?}</w:t>
+      </w:r>
+    </w:p>
+    <w:p>
+      <w:pPr>
+        <w:spacing w:line="240" w:lineRule="auto"/>
+      </w:pPr>
+      <w:r>
+        <w:t xml:space="preserve">G -- Yes --&gt; </w:t>
+      </w:r>
+      <w:r>
+        <w:t>H [</w:t>
+      </w:r>
+      <w:r>
+        <w:t>Prompt change mode or terminate]</w:t>
+      </w:r>
+    </w:p>
+    <w:p>
+      <w:pPr>
+        <w:spacing w:line="240" w:lineRule="auto"/>
+      </w:pPr>
+      <w:r>
+        <w:t>G -- No --&gt; D</w:t>
+      </w:r>
+    </w:p>
+    <w:p>
+      <w:pPr>
+        <w:spacing w:line="240" w:lineRule="auto"/>
+      </w:pPr>
+      <w:r>
+        <w:t>H --&gt; I{Terminate?}</w:t>
+      </w:r>
+    </w:p>
+    <w:p>
+      <w:pPr>
+        <w:spacing w:line="240" w:lineRule="auto"/>
+      </w:pPr>
+      <w:r>
+        <w:t xml:space="preserve">I -- Yes --&gt; </w:t>
+      </w:r>
+      <w:r>
+        <w:t>J [</w:t>
+      </w:r>
+      <w:r>
+        <w:t>Write log and End]</w:t>
+      </w:r>
+    </w:p>
+    <w:p>
+      <w:pPr>
+        <w:spacing w:line="240" w:lineRule="auto"/>
+      </w:pPr>
+      <w:r>
+        <w:t>I -- No --&gt; B</w:t>
       </w:r>
     </w:p>
     <w:p>

</xml_diff>

<commit_message>
Flowchart2 validate mode QR
</commit_message>
<xml_diff>
--- a/SwiftBot Task10 - Requirements.docx
+++ b/SwiftBot Task10 - Requirements.docx
@@ -1519,7 +1519,228 @@
     <w:p>
       <w:pPr>
         <w:spacing w:line="240" w:lineRule="auto"/>
-        <w:jc w:val="center"/>
+      </w:pPr>
+      <w:r>
+        <w:t>FLOWCHART</w:t>
+      </w:r>
+      <w:r>
+        <w:t xml:space="preserve">2 </w:t>
+      </w:r>
+      <w:r>
+        <w:t>(</w:t>
+      </w:r>
+      <w:r>
+        <w:t xml:space="preserve">VALIDATE </w:t>
+      </w:r>
+      <w:r>
+        <w:t>MODE QR)</w:t>
+      </w:r>
+    </w:p>
+    <w:tbl>
+      <w:tblPr>
+        <w:tblStyle w:val="TableGrid"/>
+        <w:tblW w:w="0" w:type="auto"/>
+        <w:tblLook w:val="04A0" w:firstRow="1" w:lastRow="0" w:firstColumn="1" w:lastColumn="0" w:noHBand="0" w:noVBand="1"/>
+      </w:tblPr>
+      <w:tblGrid>
+        <w:gridCol w:w="9016"/>
+      </w:tblGrid>
+      <w:tr>
+        <w:tc>
+          <w:tcPr>
+            <w:tcW w:w="9016" w:type="dxa"/>
+          </w:tcPr>
+          <w:p>
+            <w:r>
+              <w:t>READ QR INPUT</w:t>
+            </w:r>
+          </w:p>
+        </w:tc>
+      </w:tr>
+      <w:tr>
+        <w:tc>
+          <w:tcPr>
+            <w:tcW w:w="9016" w:type="dxa"/>
+          </w:tcPr>
+          <w:p>
+            <w:r>
+              <w:t xml:space="preserve">IS INPUT ONE VALID MODE? </w:t>
+            </w:r>
+          </w:p>
+        </w:tc>
+      </w:tr>
+      <w:tr>
+        <w:tc>
+          <w:tcPr>
+            <w:tcW w:w="9016" w:type="dxa"/>
+          </w:tcPr>
+          <w:p>
+            <w:r>
+              <w:rPr>
+                <w:noProof/>
+              </w:rPr>
+              <mc:AlternateContent>
+                <mc:Choice Requires="wps">
+                  <w:drawing>
+                    <wp:anchor distT="0" distB="0" distL="114300" distR="114300" simplePos="0" relativeHeight="251661312" behindDoc="0" locked="0" layoutInCell="1" allowOverlap="1" wp14:anchorId="242DC149" wp14:editId="0A5CC9FE">
+                      <wp:simplePos x="0" y="0"/>
+                      <wp:positionH relativeFrom="column">
+                        <wp:posOffset>385445</wp:posOffset>
+                      </wp:positionH>
+                      <wp:positionV relativeFrom="paragraph">
+                        <wp:posOffset>102235</wp:posOffset>
+                      </wp:positionV>
+                      <wp:extent cx="311150" cy="0"/>
+                      <wp:effectExtent l="0" t="76200" r="12700" b="95250"/>
+                      <wp:wrapNone/>
+                      <wp:docPr id="735396486" name="Straight Arrow Connector 1"/>
+                      <wp:cNvGraphicFramePr/>
+                      <a:graphic xmlns:a="http://schemas.openxmlformats.org/drawingml/2006/main">
+                        <a:graphicData uri="http://schemas.microsoft.com/office/word/2010/wordprocessingShape">
+                          <wps:wsp>
+                            <wps:cNvCnPr/>
+                            <wps:spPr>
+                              <a:xfrm>
+                                <a:off x="0" y="0"/>
+                                <a:ext cx="311150" cy="0"/>
+                              </a:xfrm>
+                              <a:prstGeom prst="straightConnector1">
+                                <a:avLst/>
+                              </a:prstGeom>
+                              <a:ln>
+                                <a:tailEnd type="triangle"/>
+                              </a:ln>
+                            </wps:spPr>
+                            <wps:style>
+                              <a:lnRef idx="2">
+                                <a:schemeClr val="accent1"/>
+                              </a:lnRef>
+                              <a:fillRef idx="0">
+                                <a:schemeClr val="accent1"/>
+                              </a:fillRef>
+                              <a:effectRef idx="1">
+                                <a:schemeClr val="accent1"/>
+                              </a:effectRef>
+                              <a:fontRef idx="minor">
+                                <a:schemeClr val="tx1"/>
+                              </a:fontRef>
+                            </wps:style>
+                            <wps:bodyPr/>
+                          </wps:wsp>
+                        </a:graphicData>
+                      </a:graphic>
+                    </wp:anchor>
+                  </w:drawing>
+                </mc:Choice>
+                <mc:Fallback>
+                  <w:pict>
+                    <v:shapetype w14:anchorId="4E41C259" id="_x0000_t32" coordsize="21600,21600" o:spt="32" o:oned="t" path="m,l21600,21600e" filled="f">
+                      <v:path arrowok="t" fillok="f" o:connecttype="none"/>
+                      <o:lock v:ext="edit" shapetype="t"/>
+                    </v:shapetype>
+                    <v:shape id="Straight Arrow Connector 1" o:spid="_x0000_s1026" type="#_x0000_t32" style="position:absolute;margin-left:30.35pt;margin-top:8.05pt;width:24.5pt;height:0;z-index:251661312;visibility:visible;mso-wrap-style:square;mso-wrap-distance-left:9pt;mso-wrap-distance-top:0;mso-wrap-distance-right:9pt;mso-wrap-distance-bottom:0;mso-position-horizontal:absolute;mso-position-horizontal-relative:text;mso-position-vertical:absolute;mso-position-vertical-relative:text" o:gfxdata="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" strokecolor="#156082 [3204]" strokeweight="1.5pt">
+                      <v:stroke endarrow="block" joinstyle="miter"/>
+                    </v:shape>
+                  </w:pict>
+                </mc:Fallback>
+              </mc:AlternateContent>
+            </w:r>
+            <w:r>
+              <w:t>IF NO            DISPLAY ERROR AND SCAN</w:t>
+            </w:r>
+          </w:p>
+        </w:tc>
+      </w:tr>
+      <w:tr>
+        <w:tc>
+          <w:tcPr>
+            <w:tcW w:w="9016" w:type="dxa"/>
+          </w:tcPr>
+          <w:p>
+            <w:r>
+              <w:rPr>
+                <w:noProof/>
+              </w:rPr>
+              <mc:AlternateContent>
+                <mc:Choice Requires="wps">
+                  <w:drawing>
+                    <wp:anchor distT="0" distB="0" distL="114300" distR="114300" simplePos="0" relativeHeight="251662336" behindDoc="0" locked="0" layoutInCell="1" allowOverlap="1" wp14:anchorId="538EE539" wp14:editId="031E5021">
+                      <wp:simplePos x="0" y="0"/>
+                      <wp:positionH relativeFrom="column">
+                        <wp:posOffset>467995</wp:posOffset>
+                      </wp:positionH>
+                      <wp:positionV relativeFrom="paragraph">
+                        <wp:posOffset>104775</wp:posOffset>
+                      </wp:positionV>
+                      <wp:extent cx="374650" cy="0"/>
+                      <wp:effectExtent l="0" t="76200" r="25400" b="95250"/>
+                      <wp:wrapNone/>
+                      <wp:docPr id="1992914331" name="Straight Arrow Connector 2"/>
+                      <wp:cNvGraphicFramePr/>
+                      <a:graphic xmlns:a="http://schemas.openxmlformats.org/drawingml/2006/main">
+                        <a:graphicData uri="http://schemas.microsoft.com/office/word/2010/wordprocessingShape">
+                          <wps:wsp>
+                            <wps:cNvCnPr/>
+                            <wps:spPr>
+                              <a:xfrm>
+                                <a:off x="0" y="0"/>
+                                <a:ext cx="374650" cy="0"/>
+                              </a:xfrm>
+                              <a:prstGeom prst="straightConnector1">
+                                <a:avLst/>
+                              </a:prstGeom>
+                              <a:ln>
+                                <a:tailEnd type="triangle"/>
+                              </a:ln>
+                            </wps:spPr>
+                            <wps:style>
+                              <a:lnRef idx="2">
+                                <a:schemeClr val="accent1"/>
+                              </a:lnRef>
+                              <a:fillRef idx="0">
+                                <a:schemeClr val="accent1"/>
+                              </a:fillRef>
+                              <a:effectRef idx="1">
+                                <a:schemeClr val="accent1"/>
+                              </a:effectRef>
+                              <a:fontRef idx="minor">
+                                <a:schemeClr val="tx1"/>
+                              </a:fontRef>
+                            </wps:style>
+                            <wps:bodyPr/>
+                          </wps:wsp>
+                        </a:graphicData>
+                      </a:graphic>
+                    </wp:anchor>
+                  </w:drawing>
+                </mc:Choice>
+                <mc:Fallback>
+                  <w:pict>
+                    <v:shape w14:anchorId="5640265C" id="Straight Arrow Connector 2" o:spid="_x0000_s1026" type="#_x0000_t32" style="position:absolute;margin-left:36.85pt;margin-top:8.25pt;width:29.5pt;height:0;z-index:251662336;visibility:visible;mso-wrap-style:square;mso-wrap-distance-left:9pt;mso-wrap-distance-top:0;mso-wrap-distance-right:9pt;mso-wrap-distance-bottom:0;mso-position-horizontal:absolute;mso-position-horizontal-relative:text;mso-position-vertical:absolute;mso-position-vertical-relative:text" o:gfxdata="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" strokecolor="#156082 [3204]" strokeweight="1.5pt">
+                      <v:stroke endarrow="block" joinstyle="miter"/>
+                    </v:shape>
+                  </w:pict>
+                </mc:Fallback>
+              </mc:AlternateContent>
+            </w:r>
+            <w:r>
+              <w:t xml:space="preserve">IF YES                </w:t>
+            </w:r>
+            <w:r>
+              <w:t>SET SELECTED MODE AND RETURN</w:t>
+            </w:r>
+          </w:p>
+        </w:tc>
+      </w:tr>
+    </w:tbl>
+    <w:p>
+      <w:pPr>
+        <w:spacing w:line="240" w:lineRule="auto"/>
+      </w:pPr>
+    </w:p>
+    <w:p>
+      <w:pPr>
+        <w:spacing w:line="240" w:lineRule="auto"/>
       </w:pPr>
     </w:p>
     <w:p>

</xml_diff>

<commit_message>
Flowcahrt 4, Wnader, Detect, and Respond
</commit_message>
<xml_diff>
--- a/SwiftBot Task10 - Requirements.docx
+++ b/SwiftBot Task10 - Requirements.docx
@@ -1637,7 +1637,7 @@
                 </mc:Choice>
                 <mc:Fallback>
                   <w:pict>
-                    <v:shapetype w14:anchorId="62E9F7CD" id="_x0000_t32" coordsize="21600,21600" o:spt="32" o:oned="t" path="m,l21600,21600e" filled="f">
+                    <v:shapetype w14:anchorId="2BEFFC9A" id="_x0000_t32" coordsize="21600,21600" o:spt="32" o:oned="t" path="m,l21600,21600e" filled="f">
                       <v:path arrowok="t" fillok="f" o:connecttype="none"/>
                       <o:lock v:ext="edit" shapetype="t"/>
                     </v:shapetype>
@@ -1719,7 +1719,7 @@
                 </mc:Choice>
                 <mc:Fallback>
                   <w:pict>
-                    <v:shape w14:anchorId="5DF40911" id="Straight Arrow Connector 2" o:spid="_x0000_s1026" type="#_x0000_t32" style="position:absolute;margin-left:36.85pt;margin-top:8.25pt;width:29.5pt;height:0;z-index:251662336;visibility:visible;mso-wrap-style:square;mso-wrap-distance-left:9pt;mso-wrap-distance-top:0;mso-wrap-distance-right:9pt;mso-wrap-distance-bottom:0;mso-position-horizontal:absolute;mso-position-horizontal-relative:text;mso-position-vertical:absolute;mso-position-vertical-relative:text" o:gfxdata="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" strokecolor="#156082 [3204]" strokeweight="1.5pt">
+                    <v:shape w14:anchorId="288C6951" id="Straight Arrow Connector 2" o:spid="_x0000_s1026" type="#_x0000_t32" style="position:absolute;margin-left:36.85pt;margin-top:8.25pt;width:29.5pt;height:0;z-index:251662336;visibility:visible;mso-wrap-style:square;mso-wrap-distance-left:9pt;mso-wrap-distance-top:0;mso-wrap-distance-right:9pt;mso-wrap-distance-bottom:0;mso-position-horizontal:absolute;mso-position-horizontal-relative:text;mso-position-vertical:absolute;mso-position-vertical-relative:text" o:gfxdata="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" strokecolor="#156082 [3204]" strokeweight="1.5pt">
                       <v:stroke endarrow="block" joinstyle="miter"/>
                     </v:shape>
                   </w:pict>
@@ -1876,7 +1876,7 @@
                 </mc:Choice>
                 <mc:Fallback>
                   <w:pict>
-                    <v:shape w14:anchorId="3B84F110" id="Straight Arrow Connector 3" o:spid="_x0000_s1026" type="#_x0000_t32" style="position:absolute;margin-left:46.35pt;margin-top:7.9pt;width:29pt;height:0;z-index:251663360;visibility:visible;mso-wrap-style:square;mso-wrap-distance-left:9pt;mso-wrap-distance-top:0;mso-wrap-distance-right:9pt;mso-wrap-distance-bottom:0;mso-position-horizontal:absolute;mso-position-horizontal-relative:text;mso-position-vertical:absolute;mso-position-vertical-relative:text" o:gfxdata="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" strokecolor="#156082 [3204]" strokeweight="1.5pt">
+                    <v:shape w14:anchorId="02DB1DF8" id="Straight Arrow Connector 3" o:spid="_x0000_s1026" type="#_x0000_t32" style="position:absolute;margin-left:46.35pt;margin-top:7.9pt;width:29pt;height:0;z-index:251663360;visibility:visible;mso-wrap-style:square;mso-wrap-distance-left:9pt;mso-wrap-distance-top:0;mso-wrap-distance-right:9pt;mso-wrap-distance-bottom:0;mso-position-horizontal:absolute;mso-position-horizontal-relative:text;mso-position-vertical:absolute;mso-position-vertical-relative:text" o:gfxdata="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" strokecolor="#156082 [3204]" strokeweight="1.5pt">
                       <v:stroke endarrow="block" joinstyle="miter"/>
                     </v:shape>
                   </w:pict>
@@ -1963,7 +1963,7 @@
                 </mc:Choice>
                 <mc:Fallback>
                   <w:pict>
-                    <v:shape w14:anchorId="0D5F3323" id="Straight Arrow Connector 4" o:spid="_x0000_s1026" type="#_x0000_t32" style="position:absolute;margin-left:46.85pt;margin-top:5.75pt;width:30.5pt;height:.5pt;z-index:251664384;visibility:visible;mso-wrap-style:square;mso-wrap-distance-left:9pt;mso-wrap-distance-top:0;mso-wrap-distance-right:9pt;mso-wrap-distance-bottom:0;mso-position-horizontal:absolute;mso-position-horizontal-relative:text;mso-position-vertical:absolute;mso-position-vertical-relative:text" o:gfxdata="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" strokecolor="#156082 [3204]" strokeweight="1.5pt">
+                    <v:shape w14:anchorId="75F99AC9" id="Straight Arrow Connector 4" o:spid="_x0000_s1026" type="#_x0000_t32" style="position:absolute;margin-left:46.85pt;margin-top:5.75pt;width:30.5pt;height:.5pt;z-index:251664384;visibility:visible;mso-wrap-style:square;mso-wrap-distance-left:9pt;mso-wrap-distance-top:0;mso-wrap-distance-right:9pt;mso-wrap-distance-bottom:0;mso-position-horizontal:absolute;mso-position-horizontal-relative:text;mso-position-vertical:absolute;mso-position-vertical-relative:text" o:gfxdata="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" strokecolor="#156082 [3204]" strokeweight="1.5pt">
                       <v:stroke endarrow="block" joinstyle="miter"/>
                     </v:shape>
                   </w:pict>
@@ -1983,6 +1983,290 @@
         </w:tc>
       </w:tr>
     </w:tbl>
+    <w:p>
+      <w:pPr>
+        <w:spacing w:line="240" w:lineRule="auto"/>
+      </w:pPr>
+    </w:p>
+    <w:p>
+      <w:pPr>
+        <w:spacing w:line="240" w:lineRule="auto"/>
+      </w:pPr>
+      <w:r>
+        <w:t xml:space="preserve">FLOWCHART </w:t>
+      </w:r>
+      <w:r>
+        <w:t>4 – WANDER, DETECT, AND RESPOND</w:t>
+      </w:r>
+    </w:p>
+    <w:p>
+      <w:pPr>
+        <w:spacing w:after="3" w:line="265" w:lineRule="auto"/>
+        <w:ind w:left="-5" w:hanging="10"/>
+        <w:rPr>
+          <w:rFonts w:ascii="Arial" w:eastAsia="Arial" w:hAnsi="Arial" w:cs="Arial"/>
+          <w:color w:val="156082" w:themeColor="accent1"/>
+          <w:sz w:val="28"/>
+          <w14:shadow w14:blurRad="38100" w14:dist="25400" w14:dir="5400000" w14:sx="100000" w14:sy="100000" w14:kx="0" w14:ky="0" w14:algn="ctr">
+            <w14:srgbClr w14:val="6E747A">
+              <w14:alpha w14:val="57000"/>
+            </w14:srgbClr>
+          </w14:shadow>
+          <w14:textOutline w14:w="0" w14:cap="flat" w14:cmpd="sng" w14:algn="ctr">
+            <w14:noFill/>
+            <w14:prstDash w14:val="solid"/>
+            <w14:round/>
+          </w14:textOutline>
+        </w:rPr>
+      </w:pPr>
+      <w:r>
+        <w:rPr>
+          <w:rFonts w:ascii="Arial" w:eastAsia="Arial" w:hAnsi="Arial" w:cs="Arial"/>
+          <w:color w:val="156082" w:themeColor="accent1"/>
+          <w:sz w:val="28"/>
+          <w14:shadow w14:blurRad="38100" w14:dist="25400" w14:dir="5400000" w14:sx="100000" w14:sy="100000" w14:kx="0" w14:ky="0" w14:algn="ctr">
+            <w14:srgbClr w14:val="6E747A">
+              <w14:alpha w14:val="57000"/>
+            </w14:srgbClr>
+          </w14:shadow>
+          <w14:textOutline w14:w="0" w14:cap="flat" w14:cmpd="sng" w14:algn="ctr">
+            <w14:noFill/>
+            <w14:prstDash w14:val="solid"/>
+            <w14:round/>
+          </w14:textOutline>
+        </w:rPr>
+        <w:t>Flowchart 4 – Wander, Detect, and Respond</w:t>
+      </w:r>
+    </w:p>
+    <w:tbl>
+      <w:tblPr>
+        <w:tblStyle w:val="TableGrid0"/>
+        <w:tblW w:w="9623" w:type="dxa"/>
+        <w:tblInd w:w="-10" w:type="dxa"/>
+        <w:tblCellMar>
+          <w:left w:w="120" w:type="dxa"/>
+          <w:right w:w="115" w:type="dxa"/>
+        </w:tblCellMar>
+        <w:tblLook w:val="04A0" w:firstRow="1" w:lastRow="0" w:firstColumn="1" w:lastColumn="0" w:noHBand="0" w:noVBand="1"/>
+      </w:tblPr>
+      <w:tblGrid>
+        <w:gridCol w:w="9623"/>
+      </w:tblGrid>
+      <w:tr>
+        <w:trPr>
+          <w:trHeight w:val="480"/>
+        </w:trPr>
+        <w:tc>
+          <w:tcPr>
+            <w:tcW w:w="9623" w:type="dxa"/>
+            <w:tcBorders>
+              <w:top w:val="single" w:sz="8" w:space="0" w:color="000000"/>
+              <w:left w:val="single" w:sz="8" w:space="0" w:color="000000"/>
+              <w:bottom w:val="single" w:sz="4" w:space="0" w:color="000000"/>
+              <w:right w:val="single" w:sz="8" w:space="0" w:color="000000"/>
+            </w:tcBorders>
+            <w:shd w:val="clear" w:color="auto" w:fill="F5F5F5"/>
+            <w:vAlign w:val="center"/>
+          </w:tcPr>
+          <w:p>
+            <w:r>
+              <w:rPr>
+                <w:rFonts w:ascii="Arial" w:eastAsia="Arial" w:hAnsi="Arial" w:cs="Arial"/>
+                <w:sz w:val="20"/>
+              </w:rPr>
+              <w:t>Move forward briefly and turn slightly</w:t>
+            </w:r>
+          </w:p>
+        </w:tc>
+      </w:tr>
+      <w:tr>
+        <w:trPr>
+          <w:trHeight w:val="480"/>
+        </w:trPr>
+        <w:tc>
+          <w:tcPr>
+            <w:tcW w:w="9623" w:type="dxa"/>
+            <w:tcBorders>
+              <w:top w:val="single" w:sz="4" w:space="0" w:color="000000"/>
+              <w:left w:val="single" w:sz="8" w:space="0" w:color="000000"/>
+              <w:bottom w:val="single" w:sz="4" w:space="0" w:color="000000"/>
+              <w:right w:val="single" w:sz="8" w:space="0" w:color="000000"/>
+            </w:tcBorders>
+            <w:shd w:val="clear" w:color="auto" w:fill="F5F5F5"/>
+            <w:vAlign w:val="center"/>
+          </w:tcPr>
+          <w:p>
+            <w:r>
+              <w:rPr>
+                <w:rFonts w:ascii="Arial" w:eastAsia="Arial" w:hAnsi="Arial" w:cs="Arial"/>
+                <w:sz w:val="20"/>
+              </w:rPr>
+              <w:t>Read proximity sensor</w:t>
+            </w:r>
+          </w:p>
+        </w:tc>
+      </w:tr>
+      <w:tr>
+        <w:trPr>
+          <w:trHeight w:val="480"/>
+        </w:trPr>
+        <w:tc>
+          <w:tcPr>
+            <w:tcW w:w="9623" w:type="dxa"/>
+            <w:tcBorders>
+              <w:top w:val="single" w:sz="4" w:space="0" w:color="000000"/>
+              <w:left w:val="single" w:sz="8" w:space="0" w:color="000000"/>
+              <w:bottom w:val="single" w:sz="4" w:space="0" w:color="000000"/>
+              <w:right w:val="single" w:sz="8" w:space="0" w:color="000000"/>
+            </w:tcBorders>
+            <w:shd w:val="clear" w:color="auto" w:fill="F5F5F5"/>
+            <w:vAlign w:val="center"/>
+          </w:tcPr>
+          <w:p>
+            <w:r>
+              <w:rPr>
+                <w:rFonts w:ascii="Arial" w:eastAsia="Arial" w:hAnsi="Arial" w:cs="Arial"/>
+                <w:sz w:val="20"/>
+              </w:rPr>
+              <w:t>Is object detected within 2cm?</w:t>
+            </w:r>
+          </w:p>
+        </w:tc>
+      </w:tr>
+      <w:tr>
+        <w:trPr>
+          <w:trHeight w:val="480"/>
+        </w:trPr>
+        <w:tc>
+          <w:tcPr>
+            <w:tcW w:w="9623" w:type="dxa"/>
+            <w:tcBorders>
+              <w:top w:val="single" w:sz="4" w:space="0" w:color="000000"/>
+              <w:left w:val="single" w:sz="8" w:space="0" w:color="000000"/>
+              <w:bottom w:val="single" w:sz="4" w:space="0" w:color="000000"/>
+              <w:right w:val="single" w:sz="8" w:space="0" w:color="000000"/>
+            </w:tcBorders>
+            <w:shd w:val="clear" w:color="auto" w:fill="F5F5F5"/>
+            <w:vAlign w:val="center"/>
+          </w:tcPr>
+          <w:p>
+            <w:r>
+              <w:rPr>
+                <w:rFonts w:ascii="Arial" w:eastAsia="Arial" w:hAnsi="Arial" w:cs="Arial"/>
+                <w:sz w:val="20"/>
+              </w:rPr>
+              <w:t xml:space="preserve">If no </w:t>
+            </w:r>
+            <w:r>
+              <w:rPr>
+                <w:rFonts w:ascii="Segoe UI Symbol" w:eastAsia="Segoe UI Symbol" w:hAnsi="Segoe UI Symbol" w:cs="Segoe UI Symbol"/>
+                <w:sz w:val="20"/>
+              </w:rPr>
+              <w:t>→</w:t>
+            </w:r>
+            <w:r>
+              <w:rPr>
+                <w:rFonts w:ascii="Arial" w:eastAsia="Arial" w:hAnsi="Arial" w:cs="Arial"/>
+                <w:sz w:val="20"/>
+              </w:rPr>
+              <w:t xml:space="preserve"> return to wandering</w:t>
+            </w:r>
+          </w:p>
+        </w:tc>
+      </w:tr>
+      <w:tr>
+        <w:trPr>
+          <w:trHeight w:val="480"/>
+        </w:trPr>
+        <w:tc>
+          <w:tcPr>
+            <w:tcW w:w="9623" w:type="dxa"/>
+            <w:tcBorders>
+              <w:top w:val="single" w:sz="4" w:space="0" w:color="000000"/>
+              <w:left w:val="single" w:sz="8" w:space="0" w:color="000000"/>
+              <w:bottom w:val="single" w:sz="4" w:space="0" w:color="000000"/>
+              <w:right w:val="single" w:sz="8" w:space="0" w:color="000000"/>
+            </w:tcBorders>
+            <w:shd w:val="clear" w:color="auto" w:fill="F5F5F5"/>
+            <w:vAlign w:val="center"/>
+          </w:tcPr>
+          <w:p>
+            <w:r>
+              <w:rPr>
+                <w:rFonts w:ascii="Arial" w:eastAsia="Arial" w:hAnsi="Arial" w:cs="Arial"/>
+                <w:sz w:val="20"/>
+              </w:rPr>
+              <w:t xml:space="preserve">If yes </w:t>
+            </w:r>
+            <w:r>
+              <w:rPr>
+                <w:rFonts w:ascii="Segoe UI Symbol" w:eastAsia="Segoe UI Symbol" w:hAnsi="Segoe UI Symbol" w:cs="Segoe UI Symbol"/>
+                <w:sz w:val="20"/>
+              </w:rPr>
+              <w:t>→</w:t>
+            </w:r>
+            <w:r>
+              <w:rPr>
+                <w:rFonts w:ascii="Arial" w:eastAsia="Arial" w:hAnsi="Arial" w:cs="Arial"/>
+                <w:sz w:val="20"/>
+              </w:rPr>
+              <w:t xml:space="preserve"> record encounter and select behaviour (Curious/Scaredy/Dubious)</w:t>
+            </w:r>
+          </w:p>
+        </w:tc>
+      </w:tr>
+      <w:tr>
+        <w:trPr>
+          <w:trHeight w:val="480"/>
+        </w:trPr>
+        <w:tc>
+          <w:tcPr>
+            <w:tcW w:w="9623" w:type="dxa"/>
+            <w:tcBorders>
+              <w:top w:val="single" w:sz="4" w:space="0" w:color="000000"/>
+              <w:left w:val="single" w:sz="8" w:space="0" w:color="000000"/>
+              <w:bottom w:val="single" w:sz="8" w:space="0" w:color="000000"/>
+              <w:right w:val="single" w:sz="8" w:space="0" w:color="000000"/>
+            </w:tcBorders>
+            <w:shd w:val="clear" w:color="auto" w:fill="F5F5F5"/>
+            <w:vAlign w:val="center"/>
+          </w:tcPr>
+          <w:p>
+            <w:r>
+              <w:rPr>
+                <w:rFonts w:ascii="Arial" w:eastAsia="Arial" w:hAnsi="Arial" w:cs="Arial"/>
+                <w:sz w:val="20"/>
+              </w:rPr>
+              <w:t>Call appropriate response sub</w:t>
+            </w:r>
+            <w:r>
+              <w:rPr>
+                <w:rFonts w:ascii="Segoe UI Symbol" w:eastAsia="Segoe UI Symbol" w:hAnsi="Segoe UI Symbol" w:cs="Segoe UI Symbol"/>
+                <w:sz w:val="20"/>
+              </w:rPr>
+              <w:t>p</w:t>
+            </w:r>
+            <w:r>
+              <w:rPr>
+                <w:rFonts w:ascii="Arial" w:eastAsia="Arial" w:hAnsi="Arial" w:cs="Arial"/>
+                <w:sz w:val="20"/>
+              </w:rPr>
+              <w:t>rocess</w:t>
+            </w:r>
+          </w:p>
+        </w:tc>
+      </w:tr>
+    </w:tbl>
+    <w:p>
+      <w:pPr>
+        <w:spacing w:after="3" w:line="265" w:lineRule="auto"/>
+        <w:rPr>
+          <w:rFonts w:ascii="Arial" w:eastAsia="Arial" w:hAnsi="Arial" w:cs="Arial"/>
+          <w:b/>
+          <w:sz w:val="28"/>
+        </w:rPr>
+      </w:pPr>
+    </w:p>
     <w:p>
       <w:pPr>
         <w:spacing w:line="240" w:lineRule="auto"/>
@@ -4174,6 +4458,25 @@
       </w:tblBorders>
     </w:tblPr>
   </w:style>
+  <w:style w:type="table" w:customStyle="1" w:styleId="TableGrid0">
+    <w:name w:val="TableGrid"/>
+    <w:rsid w:val="009964E4"/>
+    <w:pPr>
+      <w:spacing w:after="0" w:line="240" w:lineRule="auto"/>
+    </w:pPr>
+    <w:rPr>
+      <w:rFonts w:eastAsiaTheme="minorEastAsia"/>
+      <w:lang w:eastAsia="en-GB"/>
+    </w:rPr>
+    <w:tblPr>
+      <w:tblCellMar>
+        <w:top w:w="0" w:type="dxa"/>
+        <w:left w:w="0" w:type="dxa"/>
+        <w:bottom w:w="0" w:type="dxa"/>
+        <w:right w:w="0" w:type="dxa"/>
+      </w:tblCellMar>
+    </w:tblPr>
+  </w:style>
 </w:styles>
 </file>
 

</xml_diff>

<commit_message>
Flowchart 5, Curious Response
</commit_message>
<xml_diff>
--- a/SwiftBot Task10 - Requirements.docx
+++ b/SwiftBot Task10 - Requirements.docx
@@ -1637,7 +1637,7 @@
                 </mc:Choice>
                 <mc:Fallback>
                   <w:pict>
-                    <v:shapetype w14:anchorId="2BEFFC9A" id="_x0000_t32" coordsize="21600,21600" o:spt="32" o:oned="t" path="m,l21600,21600e" filled="f">
+                    <v:shapetype w14:anchorId="693B1F33" id="_x0000_t32" coordsize="21600,21600" o:spt="32" o:oned="t" path="m,l21600,21600e" filled="f">
                       <v:path arrowok="t" fillok="f" o:connecttype="none"/>
                       <o:lock v:ext="edit" shapetype="t"/>
                     </v:shapetype>
@@ -1719,7 +1719,7 @@
                 </mc:Choice>
                 <mc:Fallback>
                   <w:pict>
-                    <v:shape w14:anchorId="288C6951" id="Straight Arrow Connector 2" o:spid="_x0000_s1026" type="#_x0000_t32" style="position:absolute;margin-left:36.85pt;margin-top:8.25pt;width:29.5pt;height:0;z-index:251662336;visibility:visible;mso-wrap-style:square;mso-wrap-distance-left:9pt;mso-wrap-distance-top:0;mso-wrap-distance-right:9pt;mso-wrap-distance-bottom:0;mso-position-horizontal:absolute;mso-position-horizontal-relative:text;mso-position-vertical:absolute;mso-position-vertical-relative:text" o:gfxdata="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" strokecolor="#156082 [3204]" strokeweight="1.5pt">
+                    <v:shape w14:anchorId="1B8301FF" id="Straight Arrow Connector 2" o:spid="_x0000_s1026" type="#_x0000_t32" style="position:absolute;margin-left:36.85pt;margin-top:8.25pt;width:29.5pt;height:0;z-index:251662336;visibility:visible;mso-wrap-style:square;mso-wrap-distance-left:9pt;mso-wrap-distance-top:0;mso-wrap-distance-right:9pt;mso-wrap-distance-bottom:0;mso-position-horizontal:absolute;mso-position-horizontal-relative:text;mso-position-vertical:absolute;mso-position-vertical-relative:text" o:gfxdata="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" strokecolor="#156082 [3204]" strokeweight="1.5pt">
                       <v:stroke endarrow="block" joinstyle="miter"/>
                     </v:shape>
                   </w:pict>
@@ -1876,7 +1876,7 @@
                 </mc:Choice>
                 <mc:Fallback>
                   <w:pict>
-                    <v:shape w14:anchorId="02DB1DF8" id="Straight Arrow Connector 3" o:spid="_x0000_s1026" type="#_x0000_t32" style="position:absolute;margin-left:46.35pt;margin-top:7.9pt;width:29pt;height:0;z-index:251663360;visibility:visible;mso-wrap-style:square;mso-wrap-distance-left:9pt;mso-wrap-distance-top:0;mso-wrap-distance-right:9pt;mso-wrap-distance-bottom:0;mso-position-horizontal:absolute;mso-position-horizontal-relative:text;mso-position-vertical:absolute;mso-position-vertical-relative:text" o:gfxdata="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" strokecolor="#156082 [3204]" strokeweight="1.5pt">
+                    <v:shape w14:anchorId="0B976B50" id="Straight Arrow Connector 3" o:spid="_x0000_s1026" type="#_x0000_t32" style="position:absolute;margin-left:46.35pt;margin-top:7.9pt;width:29pt;height:0;z-index:251663360;visibility:visible;mso-wrap-style:square;mso-wrap-distance-left:9pt;mso-wrap-distance-top:0;mso-wrap-distance-right:9pt;mso-wrap-distance-bottom:0;mso-position-horizontal:absolute;mso-position-horizontal-relative:text;mso-position-vertical:absolute;mso-position-vertical-relative:text" o:gfxdata="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" strokecolor="#156082 [3204]" strokeweight="1.5pt">
                       <v:stroke endarrow="block" joinstyle="miter"/>
                     </v:shape>
                   </w:pict>
@@ -1963,7 +1963,7 @@
                 </mc:Choice>
                 <mc:Fallback>
                   <w:pict>
-                    <v:shape w14:anchorId="75F99AC9" id="Straight Arrow Connector 4" o:spid="_x0000_s1026" type="#_x0000_t32" style="position:absolute;margin-left:46.85pt;margin-top:5.75pt;width:30.5pt;height:.5pt;z-index:251664384;visibility:visible;mso-wrap-style:square;mso-wrap-distance-left:9pt;mso-wrap-distance-top:0;mso-wrap-distance-right:9pt;mso-wrap-distance-bottom:0;mso-position-horizontal:absolute;mso-position-horizontal-relative:text;mso-position-vertical:absolute;mso-position-vertical-relative:text" o:gfxdata="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" strokecolor="#156082 [3204]" strokeweight="1.5pt">
+                    <v:shape w14:anchorId="237A30B7" id="Straight Arrow Connector 4" o:spid="_x0000_s1026" type="#_x0000_t32" style="position:absolute;margin-left:46.85pt;margin-top:5.75pt;width:30.5pt;height:.5pt;z-index:251664384;visibility:visible;mso-wrap-style:square;mso-wrap-distance-left:9pt;mso-wrap-distance-top:0;mso-wrap-distance-right:9pt;mso-wrap-distance-bottom:0;mso-position-horizontal:absolute;mso-position-horizontal-relative:text;mso-position-vertical:absolute;mso-position-vertical-relative:text" o:gfxdata="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" strokecolor="#156082 [3204]" strokeweight="1.5pt">
                       <v:stroke endarrow="block" joinstyle="miter"/>
                     </v:shape>
                   </w:pict>
@@ -1997,45 +1997,6 @@
       </w:r>
       <w:r>
         <w:t>4 – WANDER, DETECT, AND RESPOND</w:t>
-      </w:r>
-    </w:p>
-    <w:p>
-      <w:pPr>
-        <w:spacing w:after="3" w:line="265" w:lineRule="auto"/>
-        <w:ind w:left="-5" w:hanging="10"/>
-        <w:rPr>
-          <w:rFonts w:ascii="Arial" w:eastAsia="Arial" w:hAnsi="Arial" w:cs="Arial"/>
-          <w:color w:val="156082" w:themeColor="accent1"/>
-          <w:sz w:val="28"/>
-          <w14:shadow w14:blurRad="38100" w14:dist="25400" w14:dir="5400000" w14:sx="100000" w14:sy="100000" w14:kx="0" w14:ky="0" w14:algn="ctr">
-            <w14:srgbClr w14:val="6E747A">
-              <w14:alpha w14:val="57000"/>
-            </w14:srgbClr>
-          </w14:shadow>
-          <w14:textOutline w14:w="0" w14:cap="flat" w14:cmpd="sng" w14:algn="ctr">
-            <w14:noFill/>
-            <w14:prstDash w14:val="solid"/>
-            <w14:round/>
-          </w14:textOutline>
-        </w:rPr>
-      </w:pPr>
-      <w:r>
-        <w:rPr>
-          <w:rFonts w:ascii="Arial" w:eastAsia="Arial" w:hAnsi="Arial" w:cs="Arial"/>
-          <w:color w:val="156082" w:themeColor="accent1"/>
-          <w:sz w:val="28"/>
-          <w14:shadow w14:blurRad="38100" w14:dist="25400" w14:dir="5400000" w14:sx="100000" w14:sy="100000" w14:kx="0" w14:ky="0" w14:algn="ctr">
-            <w14:srgbClr w14:val="6E747A">
-              <w14:alpha w14:val="57000"/>
-            </w14:srgbClr>
-          </w14:shadow>
-          <w14:textOutline w14:w="0" w14:cap="flat" w14:cmpd="sng" w14:algn="ctr">
-            <w14:noFill/>
-            <w14:prstDash w14:val="solid"/>
-            <w14:round/>
-          </w14:textOutline>
-        </w:rPr>
-        <w:t>Flowchart 4 – Wander, Detect, and Respond</w:t>
       </w:r>
     </w:p>
     <w:tbl>
@@ -2264,6 +2225,299 @@
           <w:rFonts w:ascii="Arial" w:eastAsia="Arial" w:hAnsi="Arial" w:cs="Arial"/>
           <w:b/>
           <w:sz w:val="28"/>
+        </w:rPr>
+      </w:pPr>
+    </w:p>
+    <w:p>
+      <w:pPr>
+        <w:spacing w:after="3" w:line="265" w:lineRule="auto"/>
+        <w:rPr>
+          <w:rFonts w:ascii="Arial" w:eastAsia="Arial" w:hAnsi="Arial" w:cs="Arial"/>
+          <w:bCs/>
+        </w:rPr>
+      </w:pPr>
+      <w:r>
+        <w:rPr>
+          <w:rFonts w:ascii="Arial" w:eastAsia="Arial" w:hAnsi="Arial" w:cs="Arial"/>
+          <w:bCs/>
+        </w:rPr>
+        <w:t>FLOWCHART 5 – CURIOUS RESPONSE</w:t>
+      </w:r>
+    </w:p>
+    <w:tbl>
+      <w:tblPr>
+        <w:tblStyle w:val="TableGrid0"/>
+        <w:tblW w:w="9623" w:type="dxa"/>
+        <w:tblInd w:w="-10" w:type="dxa"/>
+        <w:tblCellMar>
+          <w:left w:w="120" w:type="dxa"/>
+          <w:right w:w="115" w:type="dxa"/>
+        </w:tblCellMar>
+        <w:tblLook w:val="04A0" w:firstRow="1" w:lastRow="0" w:firstColumn="1" w:lastColumn="0" w:noHBand="0" w:noVBand="1"/>
+      </w:tblPr>
+      <w:tblGrid>
+        <w:gridCol w:w="9623"/>
+      </w:tblGrid>
+      <w:tr>
+        <w:trPr>
+          <w:trHeight w:val="480"/>
+        </w:trPr>
+        <w:tc>
+          <w:tcPr>
+            <w:tcW w:w="9623" w:type="dxa"/>
+            <w:tcBorders>
+              <w:top w:val="single" w:sz="8" w:space="0" w:color="000000"/>
+              <w:left w:val="single" w:sz="8" w:space="0" w:color="000000"/>
+              <w:bottom w:val="single" w:sz="4" w:space="0" w:color="000000"/>
+              <w:right w:val="single" w:sz="8" w:space="0" w:color="000000"/>
+            </w:tcBorders>
+            <w:shd w:val="clear" w:color="auto" w:fill="F5F5F5"/>
+            <w:vAlign w:val="center"/>
+          </w:tcPr>
+          <w:p>
+            <w:r>
+              <w:rPr>
+                <w:rFonts w:ascii="Arial" w:eastAsia="Arial" w:hAnsi="Arial" w:cs="Arial"/>
+                <w:sz w:val="20"/>
+              </w:rPr>
+              <w:t>Set lights green</w:t>
+            </w:r>
+          </w:p>
+        </w:tc>
+      </w:tr>
+      <w:tr>
+        <w:trPr>
+          <w:trHeight w:val="480"/>
+        </w:trPr>
+        <w:tc>
+          <w:tcPr>
+            <w:tcW w:w="9623" w:type="dxa"/>
+            <w:tcBorders>
+              <w:top w:val="single" w:sz="4" w:space="0" w:color="000000"/>
+              <w:left w:val="single" w:sz="8" w:space="0" w:color="000000"/>
+              <w:bottom w:val="single" w:sz="4" w:space="0" w:color="000000"/>
+              <w:right w:val="single" w:sz="8" w:space="0" w:color="000000"/>
+            </w:tcBorders>
+            <w:shd w:val="clear" w:color="auto" w:fill="F5F5F5"/>
+            <w:vAlign w:val="center"/>
+          </w:tcPr>
+          <w:p>
+            <w:r>
+              <w:rPr>
+                <w:rFonts w:ascii="Arial" w:eastAsia="Arial" w:hAnsi="Arial" w:cs="Arial"/>
+                <w:sz w:val="20"/>
+              </w:rPr>
+              <w:t>Read distance to object</w:t>
+            </w:r>
+          </w:p>
+        </w:tc>
+      </w:tr>
+      <w:tr>
+        <w:trPr>
+          <w:trHeight w:val="480"/>
+        </w:trPr>
+        <w:tc>
+          <w:tcPr>
+            <w:tcW w:w="9623" w:type="dxa"/>
+            <w:tcBorders>
+              <w:top w:val="single" w:sz="4" w:space="0" w:color="000000"/>
+              <w:left w:val="single" w:sz="8" w:space="0" w:color="000000"/>
+              <w:bottom w:val="single" w:sz="4" w:space="0" w:color="000000"/>
+              <w:right w:val="single" w:sz="8" w:space="0" w:color="000000"/>
+            </w:tcBorders>
+            <w:shd w:val="clear" w:color="auto" w:fill="F5F5F5"/>
+            <w:vAlign w:val="center"/>
+          </w:tcPr>
+          <w:p>
+            <w:r>
+              <w:rPr>
+                <w:rFonts w:ascii="Arial" w:eastAsia="Arial" w:hAnsi="Arial" w:cs="Arial"/>
+                <w:sz w:val="20"/>
+              </w:rPr>
+              <w:t xml:space="preserve">If distance &gt; buffer </w:t>
+            </w:r>
+            <w:r>
+              <w:rPr>
+                <w:rFonts w:ascii="Segoe UI Symbol" w:eastAsia="Segoe UI Symbol" w:hAnsi="Segoe UI Symbol" w:cs="Segoe UI Symbol"/>
+                <w:sz w:val="20"/>
+              </w:rPr>
+              <w:t>→</w:t>
+            </w:r>
+            <w:r>
+              <w:rPr>
+                <w:rFonts w:ascii="Arial" w:eastAsia="Arial" w:hAnsi="Arial" w:cs="Arial"/>
+                <w:sz w:val="20"/>
+              </w:rPr>
+              <w:t xml:space="preserve"> move forward</w:t>
+            </w:r>
+          </w:p>
+        </w:tc>
+      </w:tr>
+      <w:tr>
+        <w:trPr>
+          <w:trHeight w:val="480"/>
+        </w:trPr>
+        <w:tc>
+          <w:tcPr>
+            <w:tcW w:w="9623" w:type="dxa"/>
+            <w:tcBorders>
+              <w:top w:val="single" w:sz="4" w:space="0" w:color="000000"/>
+              <w:left w:val="single" w:sz="8" w:space="0" w:color="000000"/>
+              <w:bottom w:val="single" w:sz="4" w:space="0" w:color="000000"/>
+              <w:right w:val="single" w:sz="8" w:space="0" w:color="000000"/>
+            </w:tcBorders>
+            <w:shd w:val="clear" w:color="auto" w:fill="F5F5F5"/>
+            <w:vAlign w:val="center"/>
+          </w:tcPr>
+          <w:p>
+            <w:r>
+              <w:rPr>
+                <w:rFonts w:ascii="Arial" w:eastAsia="Arial" w:hAnsi="Arial" w:cs="Arial"/>
+                <w:sz w:val="20"/>
+              </w:rPr>
+              <w:t xml:space="preserve">If distance &lt; buffer </w:t>
+            </w:r>
+            <w:r>
+              <w:rPr>
+                <w:rFonts w:ascii="Segoe UI Symbol" w:eastAsia="Segoe UI Symbol" w:hAnsi="Segoe UI Symbol" w:cs="Segoe UI Symbol"/>
+                <w:sz w:val="20"/>
+              </w:rPr>
+              <w:t>→</w:t>
+            </w:r>
+            <w:r>
+              <w:rPr>
+                <w:rFonts w:ascii="Arial" w:eastAsia="Arial" w:hAnsi="Arial" w:cs="Arial"/>
+                <w:sz w:val="20"/>
+              </w:rPr>
+              <w:t xml:space="preserve"> move backward</w:t>
+            </w:r>
+          </w:p>
+        </w:tc>
+      </w:tr>
+      <w:tr>
+        <w:trPr>
+          <w:trHeight w:val="480"/>
+        </w:trPr>
+        <w:tc>
+          <w:tcPr>
+            <w:tcW w:w="9623" w:type="dxa"/>
+            <w:tcBorders>
+              <w:top w:val="single" w:sz="4" w:space="0" w:color="000000"/>
+              <w:left w:val="single" w:sz="8" w:space="0" w:color="000000"/>
+              <w:bottom w:val="single" w:sz="4" w:space="0" w:color="000000"/>
+              <w:right w:val="single" w:sz="8" w:space="0" w:color="000000"/>
+            </w:tcBorders>
+            <w:shd w:val="clear" w:color="auto" w:fill="F5F5F5"/>
+            <w:vAlign w:val="center"/>
+          </w:tcPr>
+          <w:p>
+            <w:r>
+              <w:rPr>
+                <w:rFonts w:ascii="Arial" w:eastAsia="Arial" w:hAnsi="Arial" w:cs="Arial"/>
+                <w:sz w:val="20"/>
+              </w:rPr>
+              <w:t xml:space="preserve">If distance == buffer </w:t>
+            </w:r>
+            <w:r>
+              <w:rPr>
+                <w:rFonts w:ascii="Segoe UI Symbol" w:eastAsia="Segoe UI Symbol" w:hAnsi="Segoe UI Symbol" w:cs="Segoe UI Symbol"/>
+                <w:sz w:val="20"/>
+              </w:rPr>
+              <w:t>→</w:t>
+            </w:r>
+            <w:r>
+              <w:rPr>
+                <w:rFonts w:ascii="Arial" w:eastAsia="Arial" w:hAnsi="Arial" w:cs="Arial"/>
+                <w:sz w:val="20"/>
+              </w:rPr>
+              <w:t xml:space="preserve"> blink green and stay still</w:t>
+            </w:r>
+          </w:p>
+        </w:tc>
+      </w:tr>
+      <w:tr>
+        <w:trPr>
+          <w:trHeight w:val="480"/>
+        </w:trPr>
+        <w:tc>
+          <w:tcPr>
+            <w:tcW w:w="9623" w:type="dxa"/>
+            <w:tcBorders>
+              <w:top w:val="single" w:sz="4" w:space="0" w:color="000000"/>
+              <w:left w:val="single" w:sz="8" w:space="0" w:color="000000"/>
+              <w:bottom w:val="single" w:sz="4" w:space="0" w:color="000000"/>
+              <w:right w:val="single" w:sz="8" w:space="0" w:color="000000"/>
+            </w:tcBorders>
+            <w:shd w:val="clear" w:color="auto" w:fill="F5F5F5"/>
+            <w:vAlign w:val="center"/>
+          </w:tcPr>
+          <w:p>
+            <w:r>
+              <w:rPr>
+                <w:rFonts w:ascii="Arial" w:eastAsia="Arial" w:hAnsi="Arial" w:cs="Arial"/>
+                <w:sz w:val="20"/>
+              </w:rPr>
+              <w:t>Capture and save image</w:t>
+            </w:r>
+          </w:p>
+        </w:tc>
+      </w:tr>
+      <w:tr>
+        <w:trPr>
+          <w:trHeight w:val="480"/>
+        </w:trPr>
+        <w:tc>
+          <w:tcPr>
+            <w:tcW w:w="9623" w:type="dxa"/>
+            <w:tcBorders>
+              <w:top w:val="single" w:sz="4" w:space="0" w:color="000000"/>
+              <w:left w:val="single" w:sz="8" w:space="0" w:color="000000"/>
+              <w:bottom w:val="single" w:sz="8" w:space="0" w:color="000000"/>
+              <w:right w:val="single" w:sz="8" w:space="0" w:color="000000"/>
+            </w:tcBorders>
+            <w:shd w:val="clear" w:color="auto" w:fill="F5F5F5"/>
+            <w:vAlign w:val="center"/>
+          </w:tcPr>
+          <w:p>
+            <w:r>
+              <w:rPr>
+                <w:rFonts w:ascii="Arial" w:eastAsia="Arial" w:hAnsi="Arial" w:cs="Arial"/>
+                <w:sz w:val="20"/>
+              </w:rPr>
+              <w:t>Return</w:t>
+            </w:r>
+          </w:p>
+        </w:tc>
+      </w:tr>
+    </w:tbl>
+    <w:p>
+      <w:pPr>
+        <w:spacing w:after="3" w:line="265" w:lineRule="auto"/>
+        <w:ind w:left="-5" w:hanging="10"/>
+        <w:rPr>
+          <w:rFonts w:ascii="Arial" w:eastAsia="Arial" w:hAnsi="Arial" w:cs="Arial"/>
+          <w:b/>
+          <w:sz w:val="28"/>
+        </w:rPr>
+      </w:pPr>
+    </w:p>
+    <w:p>
+      <w:pPr>
+        <w:spacing w:after="3" w:line="265" w:lineRule="auto"/>
+        <w:ind w:left="-5" w:hanging="10"/>
+        <w:rPr>
+          <w:rFonts w:ascii="Arial" w:eastAsia="Arial" w:hAnsi="Arial" w:cs="Arial"/>
+          <w:b/>
+          <w:sz w:val="28"/>
+        </w:rPr>
+      </w:pPr>
+    </w:p>
+    <w:p>
+      <w:pPr>
+        <w:spacing w:after="3" w:line="265" w:lineRule="auto"/>
+        <w:rPr>
+          <w:rFonts w:ascii="Arial" w:eastAsia="Arial" w:hAnsi="Arial" w:cs="Arial"/>
+          <w:bCs/>
         </w:rPr>
       </w:pPr>
     </w:p>

</xml_diff>

<commit_message>
Flowchart 6 Scaredy response
</commit_message>
<xml_diff>
--- a/SwiftBot Task10 - Requirements.docx
+++ b/SwiftBot Task10 - Requirements.docx
@@ -1637,7 +1637,7 @@
                 </mc:Choice>
                 <mc:Fallback>
                   <w:pict>
-                    <v:shapetype w14:anchorId="693B1F33" id="_x0000_t32" coordsize="21600,21600" o:spt="32" o:oned="t" path="m,l21600,21600e" filled="f">
+                    <v:shapetype w14:anchorId="07A5AD01" id="_x0000_t32" coordsize="21600,21600" o:spt="32" o:oned="t" path="m,l21600,21600e" filled="f">
                       <v:path arrowok="t" fillok="f" o:connecttype="none"/>
                       <o:lock v:ext="edit" shapetype="t"/>
                     </v:shapetype>
@@ -1719,7 +1719,7 @@
                 </mc:Choice>
                 <mc:Fallback>
                   <w:pict>
-                    <v:shape w14:anchorId="1B8301FF" id="Straight Arrow Connector 2" o:spid="_x0000_s1026" type="#_x0000_t32" style="position:absolute;margin-left:36.85pt;margin-top:8.25pt;width:29.5pt;height:0;z-index:251662336;visibility:visible;mso-wrap-style:square;mso-wrap-distance-left:9pt;mso-wrap-distance-top:0;mso-wrap-distance-right:9pt;mso-wrap-distance-bottom:0;mso-position-horizontal:absolute;mso-position-horizontal-relative:text;mso-position-vertical:absolute;mso-position-vertical-relative:text" o:gfxdata="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" strokecolor="#156082 [3204]" strokeweight="1.5pt">
+                    <v:shape w14:anchorId="739B84A1" id="Straight Arrow Connector 2" o:spid="_x0000_s1026" type="#_x0000_t32" style="position:absolute;margin-left:36.85pt;margin-top:8.25pt;width:29.5pt;height:0;z-index:251662336;visibility:visible;mso-wrap-style:square;mso-wrap-distance-left:9pt;mso-wrap-distance-top:0;mso-wrap-distance-right:9pt;mso-wrap-distance-bottom:0;mso-position-horizontal:absolute;mso-position-horizontal-relative:text;mso-position-vertical:absolute;mso-position-vertical-relative:text" o:gfxdata="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" strokecolor="#156082 [3204]" strokeweight="1.5pt">
                       <v:stroke endarrow="block" joinstyle="miter"/>
                     </v:shape>
                   </w:pict>
@@ -1876,7 +1876,7 @@
                 </mc:Choice>
                 <mc:Fallback>
                   <w:pict>
-                    <v:shape w14:anchorId="0B976B50" id="Straight Arrow Connector 3" o:spid="_x0000_s1026" type="#_x0000_t32" style="position:absolute;margin-left:46.35pt;margin-top:7.9pt;width:29pt;height:0;z-index:251663360;visibility:visible;mso-wrap-style:square;mso-wrap-distance-left:9pt;mso-wrap-distance-top:0;mso-wrap-distance-right:9pt;mso-wrap-distance-bottom:0;mso-position-horizontal:absolute;mso-position-horizontal-relative:text;mso-position-vertical:absolute;mso-position-vertical-relative:text" o:gfxdata="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" strokecolor="#156082 [3204]" strokeweight="1.5pt">
+                    <v:shape w14:anchorId="7A875721" id="Straight Arrow Connector 3" o:spid="_x0000_s1026" type="#_x0000_t32" style="position:absolute;margin-left:46.35pt;margin-top:7.9pt;width:29pt;height:0;z-index:251663360;visibility:visible;mso-wrap-style:square;mso-wrap-distance-left:9pt;mso-wrap-distance-top:0;mso-wrap-distance-right:9pt;mso-wrap-distance-bottom:0;mso-position-horizontal:absolute;mso-position-horizontal-relative:text;mso-position-vertical:absolute;mso-position-vertical-relative:text" o:gfxdata="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" strokecolor="#156082 [3204]" strokeweight="1.5pt">
                       <v:stroke endarrow="block" joinstyle="miter"/>
                     </v:shape>
                   </w:pict>
@@ -1963,7 +1963,7 @@
                 </mc:Choice>
                 <mc:Fallback>
                   <w:pict>
-                    <v:shape w14:anchorId="237A30B7" id="Straight Arrow Connector 4" o:spid="_x0000_s1026" type="#_x0000_t32" style="position:absolute;margin-left:46.85pt;margin-top:5.75pt;width:30.5pt;height:.5pt;z-index:251664384;visibility:visible;mso-wrap-style:square;mso-wrap-distance-left:9pt;mso-wrap-distance-top:0;mso-wrap-distance-right:9pt;mso-wrap-distance-bottom:0;mso-position-horizontal:absolute;mso-position-horizontal-relative:text;mso-position-vertical:absolute;mso-position-vertical-relative:text" o:gfxdata="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" strokecolor="#156082 [3204]" strokeweight="1.5pt">
+                    <v:shape w14:anchorId="2512D5C3" id="Straight Arrow Connector 4" o:spid="_x0000_s1026" type="#_x0000_t32" style="position:absolute;margin-left:46.85pt;margin-top:5.75pt;width:30.5pt;height:.5pt;z-index:251664384;visibility:visible;mso-wrap-style:square;mso-wrap-distance-left:9pt;mso-wrap-distance-top:0;mso-wrap-distance-right:9pt;mso-wrap-distance-bottom:0;mso-position-horizontal:absolute;mso-position-horizontal-relative:text;mso-position-vertical:absolute;mso-position-vertical-relative:text" o:gfxdata="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" strokecolor="#156082 [3204]" strokeweight="1.5pt">
                       <v:stroke endarrow="block" joinstyle="miter"/>
                     </v:shape>
                   </w:pict>
@@ -2507,7 +2507,217 @@
         <w:ind w:left="-5" w:hanging="10"/>
         <w:rPr>
           <w:rFonts w:ascii="Arial" w:eastAsia="Arial" w:hAnsi="Arial" w:cs="Arial"/>
-          <w:b/>
+          <w:bCs/>
+          <w:sz w:val="28"/>
+        </w:rPr>
+      </w:pPr>
+      <w:r>
+        <w:rPr>
+          <w:rFonts w:ascii="Arial" w:eastAsia="Arial" w:hAnsi="Arial" w:cs="Arial"/>
+          <w:bCs/>
+          <w:sz w:val="28"/>
+        </w:rPr>
+        <w:t xml:space="preserve">FLOWCHART 6 </w:t>
+      </w:r>
+      <w:r>
+        <w:rPr>
+          <w:rFonts w:ascii="Arial" w:eastAsia="Arial" w:hAnsi="Arial" w:cs="Arial"/>
+          <w:bCs/>
+          <w:sz w:val="28"/>
+        </w:rPr>
+        <w:t xml:space="preserve">– SCAREDY RESPONSE </w:t>
+      </w:r>
+    </w:p>
+    <w:tbl>
+      <w:tblPr>
+        <w:tblStyle w:val="TableGrid0"/>
+        <w:tblW w:w="9623" w:type="dxa"/>
+        <w:tblInd w:w="-10" w:type="dxa"/>
+        <w:tblCellMar>
+          <w:left w:w="120" w:type="dxa"/>
+          <w:right w:w="115" w:type="dxa"/>
+        </w:tblCellMar>
+        <w:tblLook w:val="04A0" w:firstRow="1" w:lastRow="0" w:firstColumn="1" w:lastColumn="0" w:noHBand="0" w:noVBand="1"/>
+      </w:tblPr>
+      <w:tblGrid>
+        <w:gridCol w:w="9623"/>
+      </w:tblGrid>
+      <w:tr>
+        <w:trPr>
+          <w:trHeight w:val="480"/>
+        </w:trPr>
+        <w:tc>
+          <w:tcPr>
+            <w:tcW w:w="9623" w:type="dxa"/>
+            <w:tcBorders>
+              <w:top w:val="single" w:sz="4" w:space="0" w:color="000000"/>
+              <w:left w:val="single" w:sz="8" w:space="0" w:color="000000"/>
+              <w:bottom w:val="single" w:sz="4" w:space="0" w:color="000000"/>
+              <w:right w:val="single" w:sz="8" w:space="0" w:color="000000"/>
+            </w:tcBorders>
+            <w:shd w:val="clear" w:color="auto" w:fill="F5F5F5"/>
+            <w:vAlign w:val="center"/>
+          </w:tcPr>
+          <w:p>
+            <w:pPr>
+              <w:rPr>
+                <w:rFonts w:ascii="Arial" w:eastAsia="Arial" w:hAnsi="Arial" w:cs="Arial"/>
+                <w:sz w:val="20"/>
+              </w:rPr>
+            </w:pPr>
+            <w:r>
+              <w:rPr>
+                <w:rFonts w:ascii="Arial" w:eastAsia="Arial" w:hAnsi="Arial" w:cs="Arial"/>
+                <w:sz w:val="20"/>
+                <w:lang w:val="en-US"/>
+              </w:rPr>
+              <w:t>If object within 50 cm</w:t>
+            </w:r>
+          </w:p>
+        </w:tc>
+      </w:tr>
+      <w:tr>
+        <w:trPr>
+          <w:trHeight w:val="480"/>
+        </w:trPr>
+        <w:tc>
+          <w:tcPr>
+            <w:tcW w:w="9623" w:type="dxa"/>
+            <w:tcBorders>
+              <w:top w:val="single" w:sz="4" w:space="0" w:color="000000"/>
+              <w:left w:val="single" w:sz="8" w:space="0" w:color="000000"/>
+              <w:bottom w:val="single" w:sz="4" w:space="0" w:color="000000"/>
+              <w:right w:val="single" w:sz="8" w:space="0" w:color="000000"/>
+            </w:tcBorders>
+            <w:shd w:val="clear" w:color="auto" w:fill="F5F5F5"/>
+            <w:vAlign w:val="center"/>
+          </w:tcPr>
+          <w:p>
+            <w:pPr>
+              <w:rPr>
+                <w:rFonts w:ascii="Arial" w:eastAsia="Arial" w:hAnsi="Arial" w:cs="Arial"/>
+                <w:sz w:val="20"/>
+              </w:rPr>
+            </w:pPr>
+            <w:r>
+              <w:rPr>
+                <w:rFonts w:ascii="Arial" w:eastAsia="Arial" w:hAnsi="Arial" w:cs="Arial"/>
+                <w:sz w:val="20"/>
+                <w:lang w:val="en-US"/>
+              </w:rPr>
+              <w:t>Capture image</w:t>
+            </w:r>
+          </w:p>
+        </w:tc>
+      </w:tr>
+      <w:tr>
+        <w:trPr>
+          <w:trHeight w:val="480"/>
+        </w:trPr>
+        <w:tc>
+          <w:tcPr>
+            <w:tcW w:w="9623" w:type="dxa"/>
+            <w:tcBorders>
+              <w:top w:val="single" w:sz="4" w:space="0" w:color="000000"/>
+              <w:left w:val="single" w:sz="8" w:space="0" w:color="000000"/>
+              <w:bottom w:val="single" w:sz="4" w:space="0" w:color="000000"/>
+              <w:right w:val="single" w:sz="8" w:space="0" w:color="000000"/>
+            </w:tcBorders>
+            <w:shd w:val="clear" w:color="auto" w:fill="F5F5F5"/>
+            <w:vAlign w:val="center"/>
+          </w:tcPr>
+          <w:p>
+            <w:pPr>
+              <w:rPr>
+                <w:rFonts w:ascii="Arial" w:eastAsia="Arial" w:hAnsi="Arial" w:cs="Arial"/>
+                <w:sz w:val="20"/>
+              </w:rPr>
+            </w:pPr>
+            <w:r>
+              <w:rPr>
+                <w:rFonts w:ascii="Arial" w:eastAsia="Arial" w:hAnsi="Arial" w:cs="Arial"/>
+                <w:sz w:val="20"/>
+                <w:lang w:val="en-US"/>
+              </w:rPr>
+              <w:t>Blink red lights</w:t>
+            </w:r>
+          </w:p>
+        </w:tc>
+      </w:tr>
+      <w:tr>
+        <w:trPr>
+          <w:trHeight w:val="480"/>
+        </w:trPr>
+        <w:tc>
+          <w:tcPr>
+            <w:tcW w:w="9623" w:type="dxa"/>
+            <w:tcBorders>
+              <w:top w:val="single" w:sz="4" w:space="0" w:color="000000"/>
+              <w:left w:val="single" w:sz="8" w:space="0" w:color="000000"/>
+              <w:bottom w:val="single" w:sz="4" w:space="0" w:color="000000"/>
+              <w:right w:val="single" w:sz="8" w:space="0" w:color="000000"/>
+            </w:tcBorders>
+            <w:shd w:val="clear" w:color="auto" w:fill="F5F5F5"/>
+            <w:vAlign w:val="center"/>
+          </w:tcPr>
+          <w:p>
+            <w:pPr>
+              <w:rPr>
+                <w:rFonts w:ascii="Arial" w:eastAsia="Arial" w:hAnsi="Arial" w:cs="Arial"/>
+                <w:sz w:val="20"/>
+              </w:rPr>
+            </w:pPr>
+            <w:r>
+              <w:rPr>
+                <w:rFonts w:ascii="Arial" w:eastAsia="Arial" w:hAnsi="Arial" w:cs="Arial"/>
+                <w:sz w:val="20"/>
+              </w:rPr>
+              <w:t>Move backward, turn away, move away for 3 seconds</w:t>
+            </w:r>
+          </w:p>
+        </w:tc>
+      </w:tr>
+      <w:tr>
+        <w:trPr>
+          <w:trHeight w:val="480"/>
+        </w:trPr>
+        <w:tc>
+          <w:tcPr>
+            <w:tcW w:w="9623" w:type="dxa"/>
+            <w:tcBorders>
+              <w:top w:val="single" w:sz="4" w:space="0" w:color="000000"/>
+              <w:left w:val="single" w:sz="8" w:space="0" w:color="000000"/>
+              <w:bottom w:val="single" w:sz="4" w:space="0" w:color="000000"/>
+              <w:right w:val="single" w:sz="8" w:space="0" w:color="000000"/>
+            </w:tcBorders>
+            <w:shd w:val="clear" w:color="auto" w:fill="F5F5F5"/>
+            <w:vAlign w:val="center"/>
+          </w:tcPr>
+          <w:p>
+            <w:pPr>
+              <w:rPr>
+                <w:rFonts w:ascii="Arial" w:eastAsia="Arial" w:hAnsi="Arial" w:cs="Arial"/>
+                <w:sz w:val="20"/>
+              </w:rPr>
+            </w:pPr>
+            <w:r>
+              <w:rPr>
+                <w:rFonts w:ascii="Arial" w:eastAsia="Arial" w:hAnsi="Arial" w:cs="Arial"/>
+                <w:sz w:val="20"/>
+              </w:rPr>
+              <w:t>Return</w:t>
+            </w:r>
+          </w:p>
+        </w:tc>
+      </w:tr>
+    </w:tbl>
+    <w:p>
+      <w:pPr>
+        <w:spacing w:after="3" w:line="265" w:lineRule="auto"/>
+        <w:ind w:left="-5" w:hanging="10"/>
+        <w:rPr>
+          <w:rFonts w:ascii="Arial" w:eastAsia="Arial" w:hAnsi="Arial" w:cs="Arial"/>
+          <w:bCs/>
           <w:sz w:val="28"/>
         </w:rPr>
       </w:pPr>

</xml_diff>

<commit_message>
Flowchart 6 Write Log and Terminate
</commit_message>
<xml_diff>
--- a/SwiftBot Task10 - Requirements.docx
+++ b/SwiftBot Task10 - Requirements.docx
@@ -1637,7 +1637,7 @@
                 </mc:Choice>
                 <mc:Fallback>
                   <w:pict>
-                    <v:shapetype w14:anchorId="07A5AD01" id="_x0000_t32" coordsize="21600,21600" o:spt="32" o:oned="t" path="m,l21600,21600e" filled="f">
+                    <v:shapetype w14:anchorId="76EAC09A" id="_x0000_t32" coordsize="21600,21600" o:spt="32" o:oned="t" path="m,l21600,21600e" filled="f">
                       <v:path arrowok="t" fillok="f" o:connecttype="none"/>
                       <o:lock v:ext="edit" shapetype="t"/>
                     </v:shapetype>
@@ -1719,7 +1719,7 @@
                 </mc:Choice>
                 <mc:Fallback>
                   <w:pict>
-                    <v:shape w14:anchorId="739B84A1" id="Straight Arrow Connector 2" o:spid="_x0000_s1026" type="#_x0000_t32" style="position:absolute;margin-left:36.85pt;margin-top:8.25pt;width:29.5pt;height:0;z-index:251662336;visibility:visible;mso-wrap-style:square;mso-wrap-distance-left:9pt;mso-wrap-distance-top:0;mso-wrap-distance-right:9pt;mso-wrap-distance-bottom:0;mso-position-horizontal:absolute;mso-position-horizontal-relative:text;mso-position-vertical:absolute;mso-position-vertical-relative:text" o:gfxdata="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" strokecolor="#156082 [3204]" strokeweight="1.5pt">
+                    <v:shape w14:anchorId="39917EEC" id="Straight Arrow Connector 2" o:spid="_x0000_s1026" type="#_x0000_t32" style="position:absolute;margin-left:36.85pt;margin-top:8.25pt;width:29.5pt;height:0;z-index:251662336;visibility:visible;mso-wrap-style:square;mso-wrap-distance-left:9pt;mso-wrap-distance-top:0;mso-wrap-distance-right:9pt;mso-wrap-distance-bottom:0;mso-position-horizontal:absolute;mso-position-horizontal-relative:text;mso-position-vertical:absolute;mso-position-vertical-relative:text" o:gfxdata="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" strokecolor="#156082 [3204]" strokeweight="1.5pt">
                       <v:stroke endarrow="block" joinstyle="miter"/>
                     </v:shape>
                   </w:pict>
@@ -1876,7 +1876,7 @@
                 </mc:Choice>
                 <mc:Fallback>
                   <w:pict>
-                    <v:shape w14:anchorId="7A875721" id="Straight Arrow Connector 3" o:spid="_x0000_s1026" type="#_x0000_t32" style="position:absolute;margin-left:46.35pt;margin-top:7.9pt;width:29pt;height:0;z-index:251663360;visibility:visible;mso-wrap-style:square;mso-wrap-distance-left:9pt;mso-wrap-distance-top:0;mso-wrap-distance-right:9pt;mso-wrap-distance-bottom:0;mso-position-horizontal:absolute;mso-position-horizontal-relative:text;mso-position-vertical:absolute;mso-position-vertical-relative:text" o:gfxdata="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" strokecolor="#156082 [3204]" strokeweight="1.5pt">
+                    <v:shape w14:anchorId="09A3C472" id="Straight Arrow Connector 3" o:spid="_x0000_s1026" type="#_x0000_t32" style="position:absolute;margin-left:46.35pt;margin-top:7.9pt;width:29pt;height:0;z-index:251663360;visibility:visible;mso-wrap-style:square;mso-wrap-distance-left:9pt;mso-wrap-distance-top:0;mso-wrap-distance-right:9pt;mso-wrap-distance-bottom:0;mso-position-horizontal:absolute;mso-position-horizontal-relative:text;mso-position-vertical:absolute;mso-position-vertical-relative:text" o:gfxdata="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" strokecolor="#156082 [3204]" strokeweight="1.5pt">
                       <v:stroke endarrow="block" joinstyle="miter"/>
                     </v:shape>
                   </w:pict>
@@ -1963,7 +1963,7 @@
                 </mc:Choice>
                 <mc:Fallback>
                   <w:pict>
-                    <v:shape w14:anchorId="2512D5C3" id="Straight Arrow Connector 4" o:spid="_x0000_s1026" type="#_x0000_t32" style="position:absolute;margin-left:46.85pt;margin-top:5.75pt;width:30.5pt;height:.5pt;z-index:251664384;visibility:visible;mso-wrap-style:square;mso-wrap-distance-left:9pt;mso-wrap-distance-top:0;mso-wrap-distance-right:9pt;mso-wrap-distance-bottom:0;mso-position-horizontal:absolute;mso-position-horizontal-relative:text;mso-position-vertical:absolute;mso-position-vertical-relative:text" o:gfxdata="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" strokecolor="#156082 [3204]" strokeweight="1.5pt">
+                    <v:shape w14:anchorId="5B194401" id="Straight Arrow Connector 4" o:spid="_x0000_s1026" type="#_x0000_t32" style="position:absolute;margin-left:46.85pt;margin-top:5.75pt;width:30.5pt;height:.5pt;z-index:251664384;visibility:visible;mso-wrap-style:square;mso-wrap-distance-left:9pt;mso-wrap-distance-top:0;mso-wrap-distance-right:9pt;mso-wrap-distance-bottom:0;mso-position-horizontal:absolute;mso-position-horizontal-relative:text;mso-position-vertical:absolute;mso-position-vertical-relative:text" o:gfxdata="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" strokecolor="#156082 [3204]" strokeweight="1.5pt">
                       <v:stroke endarrow="block" joinstyle="miter"/>
                     </v:shape>
                   </w:pict>
@@ -2719,6 +2719,163 @@
           <w:rFonts w:ascii="Arial" w:eastAsia="Arial" w:hAnsi="Arial" w:cs="Arial"/>
           <w:bCs/>
           <w:sz w:val="28"/>
+        </w:rPr>
+      </w:pPr>
+    </w:p>
+    <w:p>
+      <w:pPr>
+        <w:spacing w:after="3" w:line="265" w:lineRule="auto"/>
+        <w:rPr>
+          <w:rFonts w:ascii="Arial" w:eastAsia="Arial" w:hAnsi="Arial" w:cs="Arial"/>
+          <w:bCs/>
+        </w:rPr>
+      </w:pPr>
+    </w:p>
+    <w:p>
+      <w:pPr>
+        <w:spacing w:after="3" w:line="265" w:lineRule="auto"/>
+        <w:rPr>
+          <w:rFonts w:ascii="Arial" w:eastAsia="Arial" w:hAnsi="Arial" w:cs="Arial"/>
+          <w:bCs/>
+        </w:rPr>
+      </w:pPr>
+      <w:r>
+        <w:rPr>
+          <w:rFonts w:ascii="Arial" w:eastAsia="Arial" w:hAnsi="Arial" w:cs="Arial"/>
+          <w:bCs/>
+        </w:rPr>
+        <w:t>FLOWCHART 7 – WRITE LOG AND TERMINATE</w:t>
+      </w:r>
+    </w:p>
+    <w:tbl>
+      <w:tblPr>
+        <w:tblStyle w:val="TableGrid0"/>
+        <w:tblW w:w="9623" w:type="dxa"/>
+        <w:tblInd w:w="-10" w:type="dxa"/>
+        <w:tblCellMar>
+          <w:left w:w="120" w:type="dxa"/>
+          <w:right w:w="115" w:type="dxa"/>
+        </w:tblCellMar>
+        <w:tblLook w:val="04A0" w:firstRow="1" w:lastRow="0" w:firstColumn="1" w:lastColumn="0" w:noHBand="0" w:noVBand="1"/>
+      </w:tblPr>
+      <w:tblGrid>
+        <w:gridCol w:w="9623"/>
+      </w:tblGrid>
+      <w:tr>
+        <w:trPr>
+          <w:trHeight w:val="480"/>
+        </w:trPr>
+        <w:tc>
+          <w:tcPr>
+            <w:tcW w:w="9623" w:type="dxa"/>
+            <w:tcBorders>
+              <w:top w:val="single" w:sz="8" w:space="0" w:color="000000"/>
+              <w:left w:val="single" w:sz="8" w:space="0" w:color="000000"/>
+              <w:bottom w:val="single" w:sz="4" w:space="0" w:color="000000"/>
+              <w:right w:val="single" w:sz="8" w:space="0" w:color="000000"/>
+            </w:tcBorders>
+            <w:shd w:val="clear" w:color="auto" w:fill="F5F5F5"/>
+            <w:vAlign w:val="center"/>
+          </w:tcPr>
+          <w:p>
+            <w:r>
+              <w:rPr>
+                <w:rFonts w:ascii="Arial" w:eastAsia="Arial" w:hAnsi="Arial" w:cs="Arial"/>
+                <w:sz w:val="20"/>
+              </w:rPr>
+              <w:t>Calculate execution duration</w:t>
+            </w:r>
+          </w:p>
+        </w:tc>
+      </w:tr>
+      <w:tr>
+        <w:trPr>
+          <w:trHeight w:val="480"/>
+        </w:trPr>
+        <w:tc>
+          <w:tcPr>
+            <w:tcW w:w="9623" w:type="dxa"/>
+            <w:tcBorders>
+              <w:top w:val="single" w:sz="4" w:space="0" w:color="000000"/>
+              <w:left w:val="single" w:sz="8" w:space="0" w:color="000000"/>
+              <w:bottom w:val="single" w:sz="4" w:space="0" w:color="000000"/>
+              <w:right w:val="single" w:sz="8" w:space="0" w:color="000000"/>
+            </w:tcBorders>
+            <w:shd w:val="clear" w:color="auto" w:fill="F5F5F5"/>
+            <w:vAlign w:val="center"/>
+          </w:tcPr>
+          <w:p>
+            <w:r>
+              <w:rPr>
+                <w:rFonts w:ascii="Arial" w:eastAsia="Arial" w:hAnsi="Arial" w:cs="Arial"/>
+                <w:sz w:val="20"/>
+              </w:rPr>
+              <w:t>Write log file (mode, duration, encounters, image paths)</w:t>
+            </w:r>
+          </w:p>
+        </w:tc>
+      </w:tr>
+      <w:tr>
+        <w:trPr>
+          <w:trHeight w:val="480"/>
+        </w:trPr>
+        <w:tc>
+          <w:tcPr>
+            <w:tcW w:w="9623" w:type="dxa"/>
+            <w:tcBorders>
+              <w:top w:val="single" w:sz="4" w:space="0" w:color="000000"/>
+              <w:left w:val="single" w:sz="8" w:space="0" w:color="000000"/>
+              <w:bottom w:val="single" w:sz="4" w:space="0" w:color="000000"/>
+              <w:right w:val="single" w:sz="8" w:space="0" w:color="000000"/>
+            </w:tcBorders>
+            <w:shd w:val="clear" w:color="auto" w:fill="F5F5F5"/>
+            <w:vAlign w:val="center"/>
+          </w:tcPr>
+          <w:p>
+            <w:r>
+              <w:rPr>
+                <w:rFonts w:ascii="Arial" w:eastAsia="Arial" w:hAnsi="Arial" w:cs="Arial"/>
+                <w:sz w:val="20"/>
+              </w:rPr>
+              <w:t>Display log file path</w:t>
+            </w:r>
+          </w:p>
+        </w:tc>
+      </w:tr>
+      <w:tr>
+        <w:trPr>
+          <w:trHeight w:val="480"/>
+        </w:trPr>
+        <w:tc>
+          <w:tcPr>
+            <w:tcW w:w="9623" w:type="dxa"/>
+            <w:tcBorders>
+              <w:top w:val="single" w:sz="4" w:space="0" w:color="000000"/>
+              <w:left w:val="single" w:sz="8" w:space="0" w:color="000000"/>
+              <w:bottom w:val="single" w:sz="8" w:space="0" w:color="000000"/>
+              <w:right w:val="single" w:sz="8" w:space="0" w:color="000000"/>
+            </w:tcBorders>
+            <w:shd w:val="clear" w:color="auto" w:fill="F5F5F5"/>
+            <w:vAlign w:val="center"/>
+          </w:tcPr>
+          <w:p>
+            <w:r>
+              <w:rPr>
+                <w:rFonts w:ascii="Arial" w:eastAsia="Arial" w:hAnsi="Arial" w:cs="Arial"/>
+                <w:sz w:val="20"/>
+              </w:rPr>
+              <w:t>End program</w:t>
+            </w:r>
+          </w:p>
+        </w:tc>
+      </w:tr>
+    </w:tbl>
+    <w:p>
+      <w:pPr>
+        <w:spacing w:after="3" w:line="265" w:lineRule="auto"/>
+        <w:rPr>
+          <w:rFonts w:ascii="Arial" w:eastAsia="Arial" w:hAnsi="Arial" w:cs="Arial"/>
+          <w:bCs/>
         </w:rPr>
       </w:pPr>
     </w:p>

</xml_diff>

<commit_message>
Improvement made to the initial Design
</commit_message>
<xml_diff>
--- a/SwiftBot Task10 - Requirements.docx
+++ b/SwiftBot Task10 - Requirements.docx
@@ -1637,7 +1637,7 @@
                 </mc:Choice>
                 <mc:Fallback>
                   <w:pict>
-                    <v:shapetype w14:anchorId="2A9808FF" id="_x0000_t32" coordsize="21600,21600" o:spt="32" o:oned="t" path="m,l21600,21600e" filled="f">
+                    <v:shapetype w14:anchorId="1F39034A" id="_x0000_t32" coordsize="21600,21600" o:spt="32" o:oned="t" path="m,l21600,21600e" filled="f">
                       <v:path arrowok="t" fillok="f" o:connecttype="none"/>
                       <o:lock v:ext="edit" shapetype="t"/>
                     </v:shapetype>
@@ -1719,7 +1719,7 @@
                 </mc:Choice>
                 <mc:Fallback>
                   <w:pict>
-                    <v:shape w14:anchorId="716E582C" id="Straight Arrow Connector 2" o:spid="_x0000_s1026" type="#_x0000_t32" style="position:absolute;margin-left:36.85pt;margin-top:8.25pt;width:29.5pt;height:0;z-index:251662336;visibility:visible;mso-wrap-style:square;mso-wrap-distance-left:9pt;mso-wrap-distance-top:0;mso-wrap-distance-right:9pt;mso-wrap-distance-bottom:0;mso-position-horizontal:absolute;mso-position-horizontal-relative:text;mso-position-vertical:absolute;mso-position-vertical-relative:text" o:gfxdata="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" strokecolor="#156082 [3204]" strokeweight="1.5pt">
+                    <v:shape w14:anchorId="737DC87B" id="Straight Arrow Connector 2" o:spid="_x0000_s1026" type="#_x0000_t32" style="position:absolute;margin-left:36.85pt;margin-top:8.25pt;width:29.5pt;height:0;z-index:251662336;visibility:visible;mso-wrap-style:square;mso-wrap-distance-left:9pt;mso-wrap-distance-top:0;mso-wrap-distance-right:9pt;mso-wrap-distance-bottom:0;mso-position-horizontal:absolute;mso-position-horizontal-relative:text;mso-position-vertical:absolute;mso-position-vertical-relative:text" o:gfxdata="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" strokecolor="#156082 [3204]" strokeweight="1.5pt">
                       <v:stroke endarrow="block" joinstyle="miter"/>
                     </v:shape>
                   </w:pict>
@@ -1876,7 +1876,7 @@
                 </mc:Choice>
                 <mc:Fallback>
                   <w:pict>
-                    <v:shape w14:anchorId="4919D0DC" id="Straight Arrow Connector 3" o:spid="_x0000_s1026" type="#_x0000_t32" style="position:absolute;margin-left:46.35pt;margin-top:7.9pt;width:29pt;height:0;z-index:251663360;visibility:visible;mso-wrap-style:square;mso-wrap-distance-left:9pt;mso-wrap-distance-top:0;mso-wrap-distance-right:9pt;mso-wrap-distance-bottom:0;mso-position-horizontal:absolute;mso-position-horizontal-relative:text;mso-position-vertical:absolute;mso-position-vertical-relative:text" o:gfxdata="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" strokecolor="#156082 [3204]" strokeweight="1.5pt">
+                    <v:shape w14:anchorId="1396ED92" id="Straight Arrow Connector 3" o:spid="_x0000_s1026" type="#_x0000_t32" style="position:absolute;margin-left:46.35pt;margin-top:7.9pt;width:29pt;height:0;z-index:251663360;visibility:visible;mso-wrap-style:square;mso-wrap-distance-left:9pt;mso-wrap-distance-top:0;mso-wrap-distance-right:9pt;mso-wrap-distance-bottom:0;mso-position-horizontal:absolute;mso-position-horizontal-relative:text;mso-position-vertical:absolute;mso-position-vertical-relative:text" o:gfxdata="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" strokecolor="#156082 [3204]" strokeweight="1.5pt">
                       <v:stroke endarrow="block" joinstyle="miter"/>
                     </v:shape>
                   </w:pict>
@@ -1963,7 +1963,7 @@
                 </mc:Choice>
                 <mc:Fallback>
                   <w:pict>
-                    <v:shape w14:anchorId="4B4C2B24" id="Straight Arrow Connector 4" o:spid="_x0000_s1026" type="#_x0000_t32" style="position:absolute;margin-left:46.85pt;margin-top:5.75pt;width:30.5pt;height:.5pt;z-index:251664384;visibility:visible;mso-wrap-style:square;mso-wrap-distance-left:9pt;mso-wrap-distance-top:0;mso-wrap-distance-right:9pt;mso-wrap-distance-bottom:0;mso-position-horizontal:absolute;mso-position-horizontal-relative:text;mso-position-vertical:absolute;mso-position-vertical-relative:text" o:gfxdata="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" strokecolor="#156082 [3204]" strokeweight="1.5pt">
+                    <v:shape w14:anchorId="76B7E8D8" id="Straight Arrow Connector 4" o:spid="_x0000_s1026" type="#_x0000_t32" style="position:absolute;margin-left:46.85pt;margin-top:5.75pt;width:30.5pt;height:.5pt;z-index:251664384;visibility:visible;mso-wrap-style:square;mso-wrap-distance-left:9pt;mso-wrap-distance-top:0;mso-wrap-distance-right:9pt;mso-wrap-distance-bottom:0;mso-position-horizontal:absolute;mso-position-horizontal-relative:text;mso-position-vertical:absolute;mso-position-vertical-relative:text" o:gfxdata="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" strokecolor="#156082 [3204]" strokeweight="1.5pt">
                       <v:stroke endarrow="block" joinstyle="miter"/>
                     </v:shape>
                   </w:pict>
@@ -3169,6 +3169,236 @@
         <w:spacing w:after="3" w:line="265" w:lineRule="auto"/>
         <w:rPr>
           <w:rFonts w:ascii="Arial" w:eastAsia="Arial" w:hAnsi="Arial" w:cs="Arial"/>
+          <w:b/>
+        </w:rPr>
+      </w:pPr>
+      <w:r>
+        <w:rPr>
+          <w:rFonts w:ascii="Arial" w:eastAsia="Arial" w:hAnsi="Arial" w:cs="Arial"/>
+          <w:b/>
+        </w:rPr>
+        <w:t>IMPROVE</w:t>
+      </w:r>
+      <w:r>
+        <w:rPr>
+          <w:rFonts w:ascii="Arial" w:eastAsia="Arial" w:hAnsi="Arial" w:cs="Arial"/>
+          <w:b/>
+        </w:rPr>
+        <w:t>MENTS MADE TO THE INITIAL UI DESIGN</w:t>
+      </w:r>
+    </w:p>
+    <w:p>
+      <w:pPr>
+        <w:pStyle w:val="ListParagraph"/>
+        <w:numPr>
+          <w:ilvl w:val="0"/>
+          <w:numId w:val="10"/>
+        </w:numPr>
+        <w:spacing w:after="3" w:line="265" w:lineRule="auto"/>
+        <w:rPr>
+          <w:rFonts w:ascii="Arial" w:eastAsia="Arial" w:hAnsi="Arial" w:cs="Arial"/>
+          <w:bCs/>
+        </w:rPr>
+      </w:pPr>
+      <w:r>
+        <w:rPr>
+          <w:rFonts w:ascii="Arial" w:eastAsia="Arial" w:hAnsi="Arial" w:cs="Arial"/>
+          <w:bCs/>
+        </w:rPr>
+        <w:t>Added a</w:t>
+      </w:r>
+      <w:r>
+        <w:rPr>
+          <w:rFonts w:ascii="Arial" w:eastAsia="Arial" w:hAnsi="Arial" w:cs="Arial"/>
+          <w:bCs/>
+        </w:rPr>
+        <w:t xml:space="preserve"> welcome screen and clear instructions for </w:t>
+      </w:r>
+      <w:r>
+        <w:rPr>
+          <w:rFonts w:ascii="Arial" w:eastAsia="Arial" w:hAnsi="Arial" w:cs="Arial"/>
+          <w:bCs/>
+        </w:rPr>
+        <w:t>the user</w:t>
+      </w:r>
+    </w:p>
+    <w:p>
+      <w:pPr>
+        <w:pStyle w:val="ListParagraph"/>
+        <w:numPr>
+          <w:ilvl w:val="0"/>
+          <w:numId w:val="10"/>
+        </w:numPr>
+        <w:spacing w:after="3" w:line="265" w:lineRule="auto"/>
+        <w:rPr>
+          <w:rFonts w:ascii="Arial" w:eastAsia="Arial" w:hAnsi="Arial" w:cs="Arial"/>
+          <w:bCs/>
+        </w:rPr>
+      </w:pPr>
+      <w:r>
+        <w:rPr>
+          <w:rFonts w:ascii="Arial" w:eastAsia="Arial" w:hAnsi="Arial" w:cs="Arial"/>
+          <w:bCs/>
+        </w:rPr>
+        <w:t xml:space="preserve">Made all user inputs </w:t>
+      </w:r>
+      <w:r>
+        <w:rPr>
+          <w:rFonts w:ascii="Arial" w:eastAsia="Arial" w:hAnsi="Arial" w:cs="Arial"/>
+          <w:bCs/>
+        </w:rPr>
+        <w:t>explicit and consistent</w:t>
+      </w:r>
+    </w:p>
+    <w:p>
+      <w:pPr>
+        <w:pStyle w:val="ListParagraph"/>
+        <w:numPr>
+          <w:ilvl w:val="0"/>
+          <w:numId w:val="10"/>
+        </w:numPr>
+        <w:spacing w:after="3" w:line="265" w:lineRule="auto"/>
+        <w:rPr>
+          <w:rFonts w:ascii="Arial" w:eastAsia="Arial" w:hAnsi="Arial" w:cs="Arial"/>
+          <w:bCs/>
+        </w:rPr>
+      </w:pPr>
+      <w:r>
+        <w:rPr>
+          <w:rFonts w:ascii="Arial" w:eastAsia="Arial" w:hAnsi="Arial" w:cs="Arial"/>
+          <w:bCs/>
+        </w:rPr>
+        <w:t xml:space="preserve">Added representative error messages for invalid inputs </w:t>
+      </w:r>
+    </w:p>
+    <w:p>
+      <w:pPr>
+        <w:pStyle w:val="ListParagraph"/>
+        <w:numPr>
+          <w:ilvl w:val="0"/>
+          <w:numId w:val="10"/>
+        </w:numPr>
+        <w:spacing w:after="3" w:line="265" w:lineRule="auto"/>
+        <w:rPr>
+          <w:rFonts w:ascii="Arial" w:eastAsia="Arial" w:hAnsi="Arial" w:cs="Arial"/>
+          <w:bCs/>
+        </w:rPr>
+      </w:pPr>
+      <w:r>
+        <w:rPr>
+          <w:rFonts w:ascii="Arial" w:eastAsia="Arial" w:hAnsi="Arial" w:cs="Arial"/>
+          <w:bCs/>
+        </w:rPr>
+        <w:t xml:space="preserve">Included </w:t>
+      </w:r>
+      <w:r>
+        <w:rPr>
+          <w:rFonts w:ascii="Arial" w:eastAsia="Arial" w:hAnsi="Arial" w:cs="Arial"/>
+          <w:bCs/>
+        </w:rPr>
+        <w:t>system-state feedback messages</w:t>
+      </w:r>
+    </w:p>
+    <w:p>
+      <w:pPr>
+        <w:pStyle w:val="ListParagraph"/>
+        <w:numPr>
+          <w:ilvl w:val="0"/>
+          <w:numId w:val="10"/>
+        </w:numPr>
+        <w:spacing w:after="3" w:line="265" w:lineRule="auto"/>
+        <w:rPr>
+          <w:rFonts w:ascii="Arial" w:eastAsia="Arial" w:hAnsi="Arial" w:cs="Arial"/>
+          <w:bCs/>
+        </w:rPr>
+      </w:pPr>
+      <w:r>
+        <w:rPr>
+          <w:rFonts w:ascii="Arial" w:eastAsia="Arial" w:hAnsi="Arial" w:cs="Arial"/>
+          <w:bCs/>
+        </w:rPr>
+        <w:t xml:space="preserve">Added safety prompts when objects </w:t>
+      </w:r>
+      <w:r>
+        <w:rPr>
+          <w:rFonts w:ascii="Arial" w:eastAsia="Arial" w:hAnsi="Arial" w:cs="Arial"/>
+          <w:bCs/>
+        </w:rPr>
+        <w:t>detection freq</w:t>
+      </w:r>
+      <w:r>
+        <w:rPr>
+          <w:rFonts w:ascii="Arial" w:eastAsia="Arial" w:hAnsi="Arial" w:cs="Arial"/>
+          <w:bCs/>
+        </w:rPr>
+        <w:t>uency is high</w:t>
+      </w:r>
+    </w:p>
+    <w:p>
+      <w:pPr>
+        <w:pStyle w:val="ListParagraph"/>
+        <w:numPr>
+          <w:ilvl w:val="0"/>
+          <w:numId w:val="10"/>
+        </w:numPr>
+        <w:spacing w:after="3" w:line="265" w:lineRule="auto"/>
+        <w:rPr>
+          <w:rFonts w:ascii="Arial" w:eastAsia="Arial" w:hAnsi="Arial" w:cs="Arial"/>
+          <w:bCs/>
+        </w:rPr>
+      </w:pPr>
+      <w:r>
+        <w:rPr>
+          <w:rFonts w:ascii="Arial" w:eastAsia="Arial" w:hAnsi="Arial" w:cs="Arial"/>
+          <w:bCs/>
+        </w:rPr>
+        <w:t>Ensure consistent for</w:t>
+      </w:r>
+      <w:r>
+        <w:rPr>
+          <w:rFonts w:ascii="Arial" w:eastAsia="Arial" w:hAnsi="Arial" w:cs="Arial"/>
+          <w:bCs/>
+        </w:rPr>
+        <w:t xml:space="preserve">matting </w:t>
+      </w:r>
+      <w:r>
+        <w:rPr>
+          <w:rFonts w:ascii="Arial" w:eastAsia="Arial" w:hAnsi="Arial" w:cs="Arial"/>
+          <w:bCs/>
+        </w:rPr>
+        <w:t xml:space="preserve">and message prefixes </w:t>
+      </w:r>
+      <w:r>
+        <w:rPr>
+          <w:rFonts w:ascii="Arial" w:eastAsia="Arial" w:hAnsi="Arial" w:cs="Arial"/>
+          <w:bCs/>
+        </w:rPr>
+        <w:t>(INFO, WARN, ERROR)</w:t>
+      </w:r>
+    </w:p>
+    <w:p>
+      <w:pPr>
+        <w:spacing w:after="3" w:line="265" w:lineRule="auto"/>
+        <w:rPr>
+          <w:rFonts w:ascii="Arial" w:eastAsia="Arial" w:hAnsi="Arial" w:cs="Arial"/>
+          <w:bCs/>
+        </w:rPr>
+      </w:pPr>
+    </w:p>
+    <w:p>
+      <w:pPr>
+        <w:spacing w:after="3" w:line="265" w:lineRule="auto"/>
+        <w:rPr>
+          <w:rFonts w:ascii="Arial" w:eastAsia="Arial" w:hAnsi="Arial" w:cs="Arial"/>
+          <w:bCs/>
+        </w:rPr>
+      </w:pPr>
+    </w:p>
+    <w:p>
+      <w:pPr>
+        <w:spacing w:after="3" w:line="265" w:lineRule="auto"/>
+        <w:rPr>
+          <w:rFonts w:ascii="Arial" w:eastAsia="Arial" w:hAnsi="Arial" w:cs="Arial"/>
           <w:bCs/>
         </w:rPr>
       </w:pPr>
@@ -4114,6 +4344,92 @@
     </w:lvl>
   </w:abstractNum>
   <w:abstractNum w:abstractNumId="6" w15:restartNumberingAfterBreak="0">
+    <w:nsid w:val="40AF4512"/>
+    <w:multiLevelType w:val="hybridMultilevel"/>
+    <w:tmpl w:val="0FDE075C"/>
+    <w:lvl w:ilvl="0" w:tplc="08090013">
+      <w:start w:val="1"/>
+      <w:numFmt w:val="upperRoman"/>
+      <w:lvlText w:val="%1."/>
+      <w:lvlJc w:val="right"/>
+      <w:pPr>
+        <w:ind w:left="720" w:hanging="360"/>
+      </w:pPr>
+    </w:lvl>
+    <w:lvl w:ilvl="1" w:tplc="08090019" w:tentative="1">
+      <w:start w:val="1"/>
+      <w:numFmt w:val="lowerLetter"/>
+      <w:lvlText w:val="%2."/>
+      <w:lvlJc w:val="left"/>
+      <w:pPr>
+        <w:ind w:left="1440" w:hanging="360"/>
+      </w:pPr>
+    </w:lvl>
+    <w:lvl w:ilvl="2" w:tplc="0809001B" w:tentative="1">
+      <w:start w:val="1"/>
+      <w:numFmt w:val="lowerRoman"/>
+      <w:lvlText w:val="%3."/>
+      <w:lvlJc w:val="right"/>
+      <w:pPr>
+        <w:ind w:left="2160" w:hanging="180"/>
+      </w:pPr>
+    </w:lvl>
+    <w:lvl w:ilvl="3" w:tplc="0809000F" w:tentative="1">
+      <w:start w:val="1"/>
+      <w:numFmt w:val="decimal"/>
+      <w:lvlText w:val="%4."/>
+      <w:lvlJc w:val="left"/>
+      <w:pPr>
+        <w:ind w:left="2880" w:hanging="360"/>
+      </w:pPr>
+    </w:lvl>
+    <w:lvl w:ilvl="4" w:tplc="08090019" w:tentative="1">
+      <w:start w:val="1"/>
+      <w:numFmt w:val="lowerLetter"/>
+      <w:lvlText w:val="%5."/>
+      <w:lvlJc w:val="left"/>
+      <w:pPr>
+        <w:ind w:left="3600" w:hanging="360"/>
+      </w:pPr>
+    </w:lvl>
+    <w:lvl w:ilvl="5" w:tplc="0809001B" w:tentative="1">
+      <w:start w:val="1"/>
+      <w:numFmt w:val="lowerRoman"/>
+      <w:lvlText w:val="%6."/>
+      <w:lvlJc w:val="right"/>
+      <w:pPr>
+        <w:ind w:left="4320" w:hanging="180"/>
+      </w:pPr>
+    </w:lvl>
+    <w:lvl w:ilvl="6" w:tplc="0809000F" w:tentative="1">
+      <w:start w:val="1"/>
+      <w:numFmt w:val="decimal"/>
+      <w:lvlText w:val="%7."/>
+      <w:lvlJc w:val="left"/>
+      <w:pPr>
+        <w:ind w:left="5040" w:hanging="360"/>
+      </w:pPr>
+    </w:lvl>
+    <w:lvl w:ilvl="7" w:tplc="08090019" w:tentative="1">
+      <w:start w:val="1"/>
+      <w:numFmt w:val="lowerLetter"/>
+      <w:lvlText w:val="%8."/>
+      <w:lvlJc w:val="left"/>
+      <w:pPr>
+        <w:ind w:left="5760" w:hanging="360"/>
+      </w:pPr>
+    </w:lvl>
+    <w:lvl w:ilvl="8" w:tplc="0809001B" w:tentative="1">
+      <w:start w:val="1"/>
+      <w:numFmt w:val="lowerRoman"/>
+      <w:lvlText w:val="%9."/>
+      <w:lvlJc w:val="right"/>
+      <w:pPr>
+        <w:ind w:left="6480" w:hanging="180"/>
+      </w:pPr>
+    </w:lvl>
+  </w:abstractNum>
+  <w:abstractNum w:abstractNumId="7" w15:restartNumberingAfterBreak="0">
     <w:nsid w:val="431248B4"/>
     <w:multiLevelType w:val="hybridMultilevel"/>
     <w:tmpl w:val="D602CC28"/>
@@ -4226,7 +4542,7 @@
       </w:rPr>
     </w:lvl>
   </w:abstractNum>
-  <w:abstractNum w:abstractNumId="7" w15:restartNumberingAfterBreak="0">
+  <w:abstractNum w:abstractNumId="8" w15:restartNumberingAfterBreak="0">
     <w:nsid w:val="45A4738B"/>
     <w:multiLevelType w:val="hybridMultilevel"/>
     <w:tmpl w:val="D80CE256"/>
@@ -4312,7 +4628,7 @@
       </w:pPr>
     </w:lvl>
   </w:abstractNum>
-  <w:abstractNum w:abstractNumId="8" w15:restartNumberingAfterBreak="0">
+  <w:abstractNum w:abstractNumId="9" w15:restartNumberingAfterBreak="0">
     <w:nsid w:val="761549F7"/>
     <w:multiLevelType w:val="hybridMultilevel"/>
     <w:tmpl w:val="BB984282"/>
@@ -4441,15 +4757,18 @@
     <w:abstractNumId w:val="2"/>
   </w:num>
   <w:num w:numId="6" w16cid:durableId="1934971347">
-    <w:abstractNumId w:val="7"/>
+    <w:abstractNumId w:val="8"/>
   </w:num>
   <w:num w:numId="7" w16cid:durableId="936402260">
     <w:abstractNumId w:val="4"/>
   </w:num>
   <w:num w:numId="8" w16cid:durableId="105733699">
-    <w:abstractNumId w:val="8"/>
+    <w:abstractNumId w:val="9"/>
   </w:num>
   <w:num w:numId="9" w16cid:durableId="1433623129">
+    <w:abstractNumId w:val="7"/>
+  </w:num>
+  <w:num w:numId="10" w16cid:durableId="1522357451">
     <w:abstractNumId w:val="6"/>
   </w:num>
 </w:numbering>

</xml_diff>